<commit_message>
Added and completed files for delivery
</commit_message>
<xml_diff>
--- a/Module 9/GreenTeam_MoffatBay_Waitlist_TestPlan.docx
+++ b/Module 9/GreenTeam_MoffatBay_Waitlist_TestPlan.docx
@@ -157,6 +157,15 @@
               </w:rPr>
               <w:t xml:space="preserve">Peer Tester: </w:t>
             </w:r>
+            <w:r>
+              <w:rPr>
+                <w:rFonts w:ascii="Arial" w:hAnsi="Arial" w:cs="Arial"/>
+                <w:color w:val="EE0000"/>
+                <w:sz w:val="20"/>
+                <w:szCs w:val="20"/>
+              </w:rPr>
+              <w:t>Jordan Dardar</w:t>
+            </w:r>
           </w:p>
         </w:tc>
       </w:tr>
@@ -211,6 +220,133 @@
           <w:tcPr>
             <w:tcW w:w="6475" w:type="dxa"/>
           </w:tcPr>
+          <w:p>
+            <w:pPr>
+              <w:pStyle w:val="NoSpacing"/>
+              <w:spacing w:before="80" w:after="80"/>
+              <w:rPr>
+                <w:rFonts w:ascii="Arial" w:hAnsi="Arial" w:cs="Arial"/>
+                <w:color w:val="EE0000"/>
+                <w:sz w:val="20"/>
+                <w:szCs w:val="20"/>
+              </w:rPr>
+            </w:pPr>
+            <w:r>
+              <w:rPr>
+                <w:rFonts w:ascii="Arial" w:hAnsi="Arial" w:cs="Arial"/>
+                <w:b/>
+                <w:bCs/>
+                <w:color w:val="EE0000"/>
+                <w:sz w:val="20"/>
+                <w:szCs w:val="20"/>
+              </w:rPr>
+              <w:t>TEAM</w:t>
+            </w:r>
+            <w:r>
+              <w:rPr>
+                <w:rFonts w:ascii="Arial" w:hAnsi="Arial" w:cs="Arial"/>
+                <w:color w:val="EE0000"/>
+                <w:sz w:val="20"/>
+                <w:szCs w:val="20"/>
+              </w:rPr>
+              <w:t xml:space="preserve">: </w:t>
+            </w:r>
+          </w:p>
+          <w:p>
+            <w:pPr>
+              <w:pStyle w:val="NoSpacing"/>
+              <w:spacing w:before="80" w:after="80"/>
+              <w:rPr>
+                <w:rFonts w:ascii="Arial" w:hAnsi="Arial" w:cs="Arial"/>
+                <w:color w:val="EE0000"/>
+                <w:sz w:val="20"/>
+                <w:szCs w:val="20"/>
+              </w:rPr>
+            </w:pPr>
+            <w:r>
+              <w:rPr>
+                <w:rFonts w:ascii="Arial" w:hAnsi="Arial" w:cs="Arial"/>
+                <w:color w:val="EE0000"/>
+                <w:sz w:val="20"/>
+                <w:szCs w:val="20"/>
+              </w:rPr>
+              <w:t>Alexander Baldree</w:t>
+            </w:r>
+          </w:p>
+          <w:p>
+            <w:pPr>
+              <w:pStyle w:val="NoSpacing"/>
+              <w:spacing w:before="80" w:after="80"/>
+              <w:rPr>
+                <w:rFonts w:ascii="Arial" w:hAnsi="Arial" w:cs="Arial"/>
+                <w:color w:val="EE0000"/>
+                <w:sz w:val="20"/>
+                <w:szCs w:val="20"/>
+              </w:rPr>
+            </w:pPr>
+            <w:r>
+              <w:rPr>
+                <w:rFonts w:ascii="Arial" w:hAnsi="Arial" w:cs="Arial"/>
+                <w:color w:val="EE0000"/>
+                <w:sz w:val="20"/>
+                <w:szCs w:val="20"/>
+              </w:rPr>
+              <w:t>Max Jankowski</w:t>
+            </w:r>
+          </w:p>
+          <w:p>
+            <w:pPr>
+              <w:pStyle w:val="NoSpacing"/>
+              <w:spacing w:before="80" w:after="80"/>
+              <w:rPr>
+                <w:rFonts w:ascii="Arial" w:hAnsi="Arial" w:cs="Arial"/>
+                <w:color w:val="EE0000"/>
+                <w:sz w:val="20"/>
+                <w:szCs w:val="20"/>
+              </w:rPr>
+            </w:pPr>
+            <w:proofErr w:type="spellStart"/>
+            <w:r>
+              <w:rPr>
+                <w:rFonts w:ascii="Arial" w:hAnsi="Arial" w:cs="Arial"/>
+                <w:color w:val="EE0000"/>
+                <w:sz w:val="20"/>
+                <w:szCs w:val="20"/>
+              </w:rPr>
+              <w:t>Aftabur</w:t>
+            </w:r>
+            <w:proofErr w:type="spellEnd"/>
+            <w:r>
+              <w:rPr>
+                <w:rFonts w:ascii="Arial" w:hAnsi="Arial" w:cs="Arial"/>
+                <w:color w:val="EE0000"/>
+                <w:sz w:val="20"/>
+                <w:szCs w:val="20"/>
+              </w:rPr>
+              <w:t xml:space="preserve"> Rahman</w:t>
+            </w:r>
+          </w:p>
+          <w:p>
+            <w:pPr>
+              <w:pStyle w:val="NoSpacing"/>
+              <w:spacing w:before="80" w:after="80"/>
+              <w:rPr>
+                <w:rFonts w:ascii="Arial" w:hAnsi="Arial" w:cs="Arial"/>
+                <w:color w:val="EE0000"/>
+                <w:sz w:val="20"/>
+                <w:szCs w:val="20"/>
+              </w:rPr>
+            </w:pPr>
+            <w:r>
+              <w:rPr>
+                <w:rFonts w:ascii="Arial" w:hAnsi="Arial" w:cs="Arial"/>
+                <w:color w:val="EE0000"/>
+                <w:sz w:val="20"/>
+                <w:szCs w:val="20"/>
+              </w:rPr>
+              <w:t>Jordan Dardar</w:t>
+            </w:r>
+          </w:p>
           <w:p>
             <w:pPr>
               <w:pStyle w:val="NoSpacing"/>
@@ -310,11 +446,6 @@
     <w:p>
       <w:pPr>
         <w:pStyle w:val="NoSpacing"/>
-        <w:rPr>
-          <w:rFonts w:ascii="Arial" w:hAnsi="Arial" w:cs="Arial"/>
-          <w:sz w:val="24"/>
-          <w:szCs w:val="24"/>
-        </w:rPr>
       </w:pPr>
       <w:r>
         <w:rPr>
@@ -325,221 +456,6 @@
         <w:t>.</w:t>
       </w:r>
     </w:p>
-    <w:sdt>
-      <w:sdtPr>
-        <w:rPr>
-          <w:rFonts w:asciiTheme="minorHAnsi" w:eastAsiaTheme="minorHAnsi" w:hAnsiTheme="minorHAnsi" w:cstheme="minorBidi"/>
-          <w:color w:val="auto"/>
-          <w:sz w:val="22"/>
-          <w:szCs w:val="22"/>
-        </w:rPr>
-        <w:id w:val="-91712969"/>
-        <w:docPartObj>
-          <w:docPartGallery w:val="Table of Contents"/>
-          <w:docPartUnique/>
-        </w:docPartObj>
-      </w:sdtPr>
-      <w:sdtEndPr>
-        <w:rPr>
-          <w:b/>
-          <w:bCs/>
-          <w:noProof/>
-        </w:rPr>
-      </w:sdtEndPr>
-      <w:sdtContent>
-        <w:p>
-          <w:pPr>
-            <w:pStyle w:val="TOCHeading"/>
-            <w:jc w:val="center"/>
-            <w:rPr>
-              <w:rFonts w:ascii="Arial" w:hAnsi="Arial" w:cs="Arial"/>
-              <w:b/>
-              <w:bCs/>
-            </w:rPr>
-          </w:pPr>
-          <w:r>
-            <w:rPr>
-              <w:b/>
-              <w:bCs/>
-            </w:rPr>
-            <w:t>TABLE OF CONTENTS</w:t>
-          </w:r>
-        </w:p>
-        <w:p>
-          <w:pPr>
-            <w:pStyle w:val="TOC1"/>
-            <w:tabs>
-              <w:tab w:val="right" w:leader="dot" w:pos="12950"/>
-            </w:tabs>
-            <w:rPr>
-              <w:rFonts w:eastAsiaTheme="minorEastAsia"/>
-              <w:noProof/>
-            </w:rPr>
-          </w:pPr>
-          <w:r>
-            <w:rPr>
-              <w:rFonts w:ascii="Arial" w:hAnsi="Arial" w:cs="Arial"/>
-            </w:rPr>
-            <w:fldChar w:fldCharType="begin"/>
-          </w:r>
-          <w:r>
-            <w:rPr>
-              <w:rFonts w:ascii="Arial" w:hAnsi="Arial" w:cs="Arial"/>
-            </w:rPr>
-            <w:instrText xml:space="preserve"> TOC \o "1-3" \h \z \u </w:instrText>
-          </w:r>
-          <w:r>
-            <w:rPr>
-              <w:rFonts w:ascii="Arial" w:hAnsi="Arial" w:cs="Arial"/>
-            </w:rPr>
-            <w:fldChar w:fldCharType="separate"/>
-          </w:r>
-          <w:hyperlink w:anchor="_Toc132718195" w:history="1">
-            <w:r>
-              <w:rPr>
-                <w:rStyle w:val="Hyperlink"/>
-                <w:rFonts w:ascii="Arial" w:hAnsi="Arial" w:cs="Arial"/>
-                <w:b/>
-                <w:bCs/>
-                <w:noProof/>
-              </w:rPr>
-              <w:t>Public Wait List Summary (No Login Required)</w:t>
-            </w:r>
-            <w:r>
-              <w:rPr>
-                <w:noProof/>
-                <w:webHidden/>
-              </w:rPr>
-              <w:tab/>
-            </w:r>
-            <w:r>
-              <w:rPr>
-                <w:noProof/>
-                <w:webHidden/>
-              </w:rPr>
-              <w:fldChar w:fldCharType="begin"/>
-            </w:r>
-            <w:r>
-              <w:rPr>
-                <w:noProof/>
-                <w:webHidden/>
-              </w:rPr>
-              <w:instrText xml:space="preserve"> PAGEREF _Toc132718195 \h </w:instrText>
-            </w:r>
-            <w:r>
-              <w:rPr>
-                <w:noProof/>
-                <w:webHidden/>
-              </w:rPr>
-            </w:r>
-            <w:r>
-              <w:rPr>
-                <w:noProof/>
-                <w:webHidden/>
-              </w:rPr>
-              <w:fldChar w:fldCharType="separate"/>
-            </w:r>
-            <w:r>
-              <w:rPr>
-                <w:noProof/>
-                <w:webHidden/>
-              </w:rPr>
-              <w:t>2</w:t>
-            </w:r>
-            <w:r>
-              <w:rPr>
-                <w:noProof/>
-                <w:webHidden/>
-              </w:rPr>
-              <w:fldChar w:fldCharType="end"/>
-            </w:r>
-          </w:hyperlink>
-        </w:p>
-        <w:p>
-          <w:pPr>
-            <w:pStyle w:val="TOC1"/>
-            <w:tabs>
-              <w:tab w:val="right" w:leader="dot" w:pos="12950"/>
-            </w:tabs>
-            <w:rPr>
-              <w:rFonts w:eastAsiaTheme="minorEastAsia"/>
-              <w:noProof/>
-            </w:rPr>
-          </w:pPr>
-          <w:hyperlink w:anchor="_Toc132718196" w:history="1">
-            <w:r>
-              <w:rPr>
-                <w:rStyle w:val="Hyperlink"/>
-                <w:rFonts w:ascii="Arial" w:hAnsi="Arial" w:cs="Arial"/>
-                <w:b/>
-                <w:bCs/>
-                <w:noProof/>
-              </w:rPr>
-              <w:t>Logged-In Customer Can Join a Wait List and See Their Position</w:t>
-            </w:r>
-            <w:r>
-              <w:rPr>
-                <w:noProof/>
-                <w:webHidden/>
-              </w:rPr>
-              <w:tab/>
-            </w:r>
-            <w:r>
-              <w:rPr>
-                <w:noProof/>
-                <w:webHidden/>
-              </w:rPr>
-              <w:fldChar w:fldCharType="begin"/>
-            </w:r>
-            <w:r>
-              <w:rPr>
-                <w:noProof/>
-                <w:webHidden/>
-              </w:rPr>
-              <w:instrText xml:space="preserve"> PAGEREF _Toc132718196 \h </w:instrText>
-            </w:r>
-            <w:r>
-              <w:rPr>
-                <w:noProof/>
-                <w:webHidden/>
-              </w:rPr>
-            </w:r>
-            <w:r>
-              <w:rPr>
-                <w:noProof/>
-                <w:webHidden/>
-              </w:rPr>
-              <w:fldChar w:fldCharType="separate"/>
-            </w:r>
-            <w:r>
-              <w:rPr>
-                <w:noProof/>
-                <w:webHidden/>
-              </w:rPr>
-              <w:t>2</w:t>
-            </w:r>
-            <w:r>
-              <w:rPr>
-                <w:noProof/>
-                <w:webHidden/>
-              </w:rPr>
-              <w:fldChar w:fldCharType="end"/>
-            </w:r>
-          </w:hyperlink>
-        </w:p>
-        <w:p>
-          <w:r>
-            <w:rPr>
-              <w:rFonts w:ascii="Arial" w:hAnsi="Arial" w:cs="Arial"/>
-              <w:b/>
-              <w:bCs/>
-              <w:noProof/>
-            </w:rPr>
-            <w:fldChar w:fldCharType="end"/>
-          </w:r>
-        </w:p>
-      </w:sdtContent>
-    </w:sdt>
     <w:p>
       <w:pPr>
         <w:pStyle w:val="NoSpacing"/>
@@ -549,6 +465,127 @@
           <w:szCs w:val="24"/>
         </w:rPr>
       </w:pPr>
+    </w:p>
+    <w:p>
+      <w:pPr>
+        <w:pStyle w:val="NoSpacing"/>
+        <w:jc w:val="center"/>
+        <w:rPr>
+          <w:rFonts w:ascii="Arial" w:hAnsi="Arial" w:cs="Arial"/>
+          <w:b/>
+          <w:bCs/>
+          <w:color w:val="4472C4" w:themeColor="accent1"/>
+          <w:sz w:val="32"/>
+          <w:szCs w:val="32"/>
+        </w:rPr>
+      </w:pPr>
+      <w:r>
+        <w:rPr>
+          <w:rFonts w:ascii="Arial" w:hAnsi="Arial" w:cs="Arial"/>
+          <w:b/>
+          <w:bCs/>
+          <w:color w:val="4472C4" w:themeColor="accent1"/>
+          <w:sz w:val="32"/>
+          <w:szCs w:val="32"/>
+        </w:rPr>
+        <w:t>Table Of Contents</w:t>
+      </w:r>
+    </w:p>
+    <w:p>
+      <w:pPr>
+        <w:pStyle w:val="NoSpacing"/>
+        <w:rPr>
+          <w:rFonts w:ascii="Arial" w:hAnsi="Arial" w:cs="Arial"/>
+          <w:sz w:val="24"/>
+          <w:szCs w:val="24"/>
+        </w:rPr>
+      </w:pPr>
+    </w:p>
+    <w:p>
+      <w:pPr>
+        <w:pStyle w:val="NoSpacing"/>
+        <w:rPr>
+          <w:rFonts w:ascii="Arial" w:hAnsi="Arial" w:cs="Arial"/>
+          <w:sz w:val="24"/>
+          <w:szCs w:val="24"/>
+        </w:rPr>
+      </w:pPr>
+      <w:r>
+        <w:rPr>
+          <w:rFonts w:ascii="Arial" w:hAnsi="Arial" w:cs="Arial"/>
+          <w:b/>
+          <w:bCs/>
+          <w:sz w:val="24"/>
+          <w:szCs w:val="24"/>
+        </w:rPr>
+        <w:t>Public Waitlist Summary with no Login Required………………………………………………………………………………</w:t>
+      </w:r>
+      <w:r>
+        <w:rPr>
+          <w:rFonts w:ascii="Arial" w:hAnsi="Arial" w:cs="Arial"/>
+          <w:sz w:val="24"/>
+          <w:szCs w:val="24"/>
+        </w:rPr>
+        <w:t>2</w:t>
+      </w:r>
+    </w:p>
+    <w:p>
+      <w:pPr>
+        <w:pStyle w:val="NoSpacing"/>
+        <w:rPr>
+          <w:rFonts w:ascii="Arial" w:hAnsi="Arial" w:cs="Arial"/>
+          <w:sz w:val="24"/>
+          <w:szCs w:val="24"/>
+        </w:rPr>
+      </w:pPr>
+    </w:p>
+    <w:p>
+      <w:pPr>
+        <w:pStyle w:val="NoSpacing"/>
+        <w:rPr>
+          <w:rFonts w:ascii="Arial" w:hAnsi="Arial" w:cs="Arial"/>
+          <w:sz w:val="24"/>
+          <w:szCs w:val="24"/>
+        </w:rPr>
+      </w:pPr>
+      <w:r>
+        <w:rPr>
+          <w:rFonts w:ascii="Arial" w:hAnsi="Arial" w:cs="Arial"/>
+          <w:b/>
+          <w:bCs/>
+          <w:sz w:val="24"/>
+          <w:szCs w:val="24"/>
+        </w:rPr>
+        <w:t>Logged In Customer Can Join a Wait list and See Position…………………………</w:t>
+      </w:r>
+      <w:r>
+        <w:rPr>
+          <w:rFonts w:ascii="Arial" w:hAnsi="Arial" w:cs="Arial"/>
+          <w:b/>
+          <w:bCs/>
+          <w:sz w:val="24"/>
+          <w:szCs w:val="24"/>
+        </w:rPr>
+        <w:t>..</w:t>
+      </w:r>
+      <w:r>
+        <w:rPr>
+          <w:rFonts w:ascii="Arial" w:hAnsi="Arial" w:cs="Arial"/>
+          <w:b/>
+          <w:bCs/>
+          <w:sz w:val="24"/>
+          <w:szCs w:val="24"/>
+        </w:rPr>
+        <w:t>………………………………………</w:t>
+      </w:r>
+      <w:r>
+        <w:rPr>
+          <w:rFonts w:ascii="Arial" w:hAnsi="Arial" w:cs="Arial"/>
+          <w:sz w:val="24"/>
+          <w:szCs w:val="24"/>
+        </w:rPr>
+        <w:t>4</w:t>
+      </w:r>
     </w:p>
     <w:p>
       <w:pPr>
@@ -620,104 +657,6 @@
         </w:rPr>
       </w:pPr>
     </w:p>
-    <w:p>
-      <w:pPr>
-        <w:pStyle w:val="NoSpacing"/>
-        <w:rPr>
-          <w:rFonts w:ascii="Arial" w:hAnsi="Arial" w:cs="Arial"/>
-          <w:sz w:val="24"/>
-          <w:szCs w:val="24"/>
-        </w:rPr>
-      </w:pPr>
-    </w:p>
-    <w:p>
-      <w:pPr>
-        <w:pStyle w:val="NoSpacing"/>
-        <w:rPr>
-          <w:rFonts w:ascii="Arial" w:hAnsi="Arial" w:cs="Arial"/>
-          <w:sz w:val="24"/>
-          <w:szCs w:val="24"/>
-        </w:rPr>
-      </w:pPr>
-    </w:p>
-    <w:p>
-      <w:pPr>
-        <w:pStyle w:val="NoSpacing"/>
-        <w:rPr>
-          <w:rFonts w:ascii="Arial" w:hAnsi="Arial" w:cs="Arial"/>
-          <w:sz w:val="24"/>
-          <w:szCs w:val="24"/>
-        </w:rPr>
-      </w:pPr>
-    </w:p>
-    <w:p>
-      <w:pPr>
-        <w:pStyle w:val="NoSpacing"/>
-        <w:rPr>
-          <w:rFonts w:ascii="Arial" w:hAnsi="Arial" w:cs="Arial"/>
-          <w:sz w:val="24"/>
-          <w:szCs w:val="24"/>
-        </w:rPr>
-      </w:pPr>
-    </w:p>
-    <w:p>
-      <w:pPr>
-        <w:pStyle w:val="NoSpacing"/>
-        <w:rPr>
-          <w:rFonts w:ascii="Arial" w:hAnsi="Arial" w:cs="Arial"/>
-          <w:sz w:val="24"/>
-          <w:szCs w:val="24"/>
-        </w:rPr>
-      </w:pPr>
-    </w:p>
-    <w:p>
-      <w:pPr>
-        <w:pStyle w:val="NoSpacing"/>
-        <w:rPr>
-          <w:rFonts w:ascii="Arial" w:hAnsi="Arial" w:cs="Arial"/>
-          <w:sz w:val="24"/>
-          <w:szCs w:val="24"/>
-        </w:rPr>
-      </w:pPr>
-    </w:p>
-    <w:p>
-      <w:pPr>
-        <w:pStyle w:val="NoSpacing"/>
-        <w:rPr>
-          <w:rFonts w:ascii="Arial" w:hAnsi="Arial" w:cs="Arial"/>
-          <w:sz w:val="24"/>
-          <w:szCs w:val="24"/>
-        </w:rPr>
-      </w:pPr>
-      <w:r>
-        <w:rPr>
-          <w:rFonts w:ascii="Arial" w:hAnsi="Arial" w:cs="Arial"/>
-          <w:sz w:val="24"/>
-          <w:szCs w:val="24"/>
-        </w:rPr>
-        <w:t xml:space="preserve"> </w:t>
-      </w:r>
-    </w:p>
-    <w:p>
-      <w:pPr>
-        <w:pStyle w:val="NoSpacing"/>
-        <w:rPr>
-          <w:rFonts w:ascii="Arial" w:hAnsi="Arial" w:cs="Arial"/>
-          <w:sz w:val="24"/>
-          <w:szCs w:val="24"/>
-        </w:rPr>
-      </w:pPr>
-    </w:p>
-    <w:p>
-      <w:pPr>
-        <w:pStyle w:val="NoSpacing"/>
-        <w:rPr>
-          <w:rFonts w:ascii="Arial" w:hAnsi="Arial" w:cs="Arial"/>
-          <w:sz w:val="24"/>
-          <w:szCs w:val="24"/>
-        </w:rPr>
-      </w:pPr>
-    </w:p>
     <w:tbl>
       <w:tblPr>
         <w:tblStyle w:val="TableGrid"/>
@@ -984,15 +923,6 @@
               </w:rPr>
               <w:t xml:space="preserve">Peer tester: </w:t>
             </w:r>
-          </w:p>
-          <w:p>
-            <w:pPr>
-              <w:rPr>
-                <w:rFonts w:ascii="Arial" w:hAnsi="Arial" w:cs="Arial"/>
-                <w:sz w:val="20"/>
-                <w:szCs w:val="20"/>
-              </w:rPr>
-            </w:pPr>
             <w:r>
               <w:rPr>
                 <w:rFonts w:ascii="Arial" w:hAnsi="Arial" w:cs="Arial"/>
@@ -1001,24 +931,46 @@
                 <w:sz w:val="20"/>
                 <w:szCs w:val="20"/>
               </w:rPr>
+              <w:t>Jordan Dardar</w:t>
+            </w:r>
+          </w:p>
+          <w:p>
+            <w:pPr>
+              <w:rPr>
+                <w:rFonts w:ascii="Arial" w:hAnsi="Arial" w:cs="Arial"/>
+                <w:sz w:val="20"/>
+                <w:szCs w:val="20"/>
+              </w:rPr>
+            </w:pPr>
+            <w:r>
+              <w:rPr>
+                <w:rFonts w:ascii="Arial" w:hAnsi="Arial" w:cs="Arial"/>
+                <w:b/>
+                <w:bCs/>
+                <w:sz w:val="20"/>
+                <w:szCs w:val="20"/>
+              </w:rPr>
               <w:t>Date tested:</w:t>
             </w:r>
             <w:r>
               <w:rPr>
                 <w:rFonts w:ascii="Arial" w:hAnsi="Arial" w:cs="Arial"/>
-                <w:sz w:val="20"/>
-                <w:szCs w:val="20"/>
-              </w:rPr>
-              <w:t xml:space="preserve"> </w:t>
-            </w:r>
-            <w:r>
-              <w:rPr>
-                <w:rFonts w:ascii="Arial" w:hAnsi="Arial" w:cs="Arial"/>
-                <w:color w:val="C00000"/>
-                <w:sz w:val="20"/>
-                <w:szCs w:val="20"/>
-              </w:rPr>
-              <w:t>&lt;yyyy/mm/dd&gt;</w:t>
+                <w:b/>
+                <w:bCs/>
+                <w:sz w:val="20"/>
+                <w:szCs w:val="20"/>
+              </w:rPr>
+              <w:t xml:space="preserve"> 2026/09</w:t>
+            </w:r>
+            <w:r>
+              <w:rPr>
+                <w:rFonts w:ascii="Arial" w:hAnsi="Arial" w:cs="Arial"/>
+                <w:b/>
+                <w:bCs/>
+                <w:sz w:val="20"/>
+                <w:szCs w:val="20"/>
+              </w:rPr>
+              <w:t>/26</w:t>
             </w:r>
           </w:p>
         </w:tc>
@@ -1567,7 +1519,51 @@
                 <w:sz w:val="20"/>
                 <w:szCs w:val="20"/>
               </w:rPr>
-              <w:t>&lt;yes/no&gt;</w:t>
+              <w:t>Yes</w:t>
+            </w:r>
+            <w:r>
+              <w:rPr>
+                <w:rFonts w:ascii="Arial" w:hAnsi="Arial" w:cs="Arial"/>
+                <w:noProof/>
+                <w:color w:val="C00000"/>
+                <w:sz w:val="20"/>
+                <w:szCs w:val="20"/>
+              </w:rPr>
+              <w:drawing>
+                <wp:inline distT="0" distB="0" distL="0" distR="0" wp14:anchorId="4CAF994A" wp14:editId="07987A09">
+                  <wp:extent cx="1165860" cy="735330"/>
+                  <wp:effectExtent l="0" t="0" r="0" b="7620"/>
+                  <wp:docPr id="594016343" name="Picture 1"/>
+                  <wp:cNvGraphicFramePr>
+                    <a:graphicFrameLocks xmlns:a="http://schemas.openxmlformats.org/drawingml/2006/main" noChangeAspect="1"/>
+                  </wp:cNvGraphicFramePr>
+                  <a:graphic xmlns:a="http://schemas.openxmlformats.org/drawingml/2006/main">
+                    <a:graphicData uri="http://schemas.openxmlformats.org/drawingml/2006/picture">
+                      <pic:pic xmlns:pic="http://schemas.openxmlformats.org/drawingml/2006/picture">
+                        <pic:nvPicPr>
+                          <pic:cNvPr id="594016343" name=""/>
+                          <pic:cNvPicPr/>
+                        </pic:nvPicPr>
+                        <pic:blipFill>
+                          <a:blip r:embed="rId8"/>
+                          <a:stretch>
+                            <a:fillRect/>
+                          </a:stretch>
+                        </pic:blipFill>
+                        <pic:spPr>
+                          <a:xfrm>
+                            <a:off x="0" y="0"/>
+                            <a:ext cx="1165860" cy="735330"/>
+                          </a:xfrm>
+                          <a:prstGeom prst="rect">
+                            <a:avLst/>
+                          </a:prstGeom>
+                        </pic:spPr>
+                      </pic:pic>
+                    </a:graphicData>
+                  </a:graphic>
+                </wp:inline>
+              </w:drawing>
             </w:r>
           </w:p>
         </w:tc>
@@ -1620,7 +1616,67 @@
                 <w:sz w:val="20"/>
                 <w:szCs w:val="20"/>
               </w:rPr>
-              <w:t>In phpMyAdmin or the MySQL CLI, run SELECT slip_type_id, COUNT(*) FROM slips WHERE status='AVAILABLE' GROUP BY slip_type_id, and compare each result to the “Current Availability” value shown on the page for the matching slip size.</w:t>
+              <w:t xml:space="preserve">In phpMyAdmin or the MySQL CLI, run SELECT </w:t>
+            </w:r>
+            <w:proofErr w:type="spellStart"/>
+            <w:r>
+              <w:rPr>
+                <w:rFonts w:ascii="Arial" w:hAnsi="Arial" w:cs="Arial"/>
+                <w:color w:val="C00000"/>
+                <w:sz w:val="20"/>
+                <w:szCs w:val="20"/>
+              </w:rPr>
+              <w:t>slip_type_id</w:t>
+            </w:r>
+            <w:proofErr w:type="spellEnd"/>
+            <w:r>
+              <w:rPr>
+                <w:rFonts w:ascii="Arial" w:hAnsi="Arial" w:cs="Arial"/>
+                <w:color w:val="C00000"/>
+                <w:sz w:val="20"/>
+                <w:szCs w:val="20"/>
+              </w:rPr>
+              <w:t xml:space="preserve">, </w:t>
+            </w:r>
+            <w:proofErr w:type="gramStart"/>
+            <w:r>
+              <w:rPr>
+                <w:rFonts w:ascii="Arial" w:hAnsi="Arial" w:cs="Arial"/>
+                <w:color w:val="C00000"/>
+                <w:sz w:val="20"/>
+                <w:szCs w:val="20"/>
+              </w:rPr>
+              <w:t>COUNT(</w:t>
+            </w:r>
+            <w:proofErr w:type="gramEnd"/>
+            <w:r>
+              <w:rPr>
+                <w:rFonts w:ascii="Arial" w:hAnsi="Arial" w:cs="Arial"/>
+                <w:color w:val="C00000"/>
+                <w:sz w:val="20"/>
+                <w:szCs w:val="20"/>
+              </w:rPr>
+              <w:t xml:space="preserve">*) FROM slips WHERE status='AVAILABLE' GROUP BY </w:t>
+            </w:r>
+            <w:proofErr w:type="spellStart"/>
+            <w:r>
+              <w:rPr>
+                <w:rFonts w:ascii="Arial" w:hAnsi="Arial" w:cs="Arial"/>
+                <w:color w:val="C00000"/>
+                <w:sz w:val="20"/>
+                <w:szCs w:val="20"/>
+              </w:rPr>
+              <w:t>slip_type_id</w:t>
+            </w:r>
+            <w:proofErr w:type="spellEnd"/>
+            <w:r>
+              <w:rPr>
+                <w:rFonts w:ascii="Arial" w:hAnsi="Arial" w:cs="Arial"/>
+                <w:color w:val="C00000"/>
+                <w:sz w:val="20"/>
+                <w:szCs w:val="20"/>
+              </w:rPr>
+              <w:t>, and compare each result to the “Current Availability” value shown on the page for the matching slip size.</w:t>
             </w:r>
           </w:p>
         </w:tc>
@@ -1716,7 +1772,7 @@
                           <pic:cNvPicPr/>
                         </pic:nvPicPr>
                         <pic:blipFill>
-                          <a:blip r:embed="rId8">
+                          <a:blip r:embed="rId9">
                             <a:extLst>
                               <a:ext uri="{28A0092B-C50C-407E-A947-70E740481C1C}">
                                 <a14:useLocalDpi xmlns:a14="http://schemas.microsoft.com/office/drawing/2010/main" val="0"/>
@@ -1765,7 +1821,51 @@
                 <w:sz w:val="20"/>
                 <w:szCs w:val="20"/>
               </w:rPr>
-              <w:t>&lt;yes/no&gt;</w:t>
+              <w:t>Yes</w:t>
+            </w:r>
+            <w:r>
+              <w:rPr>
+                <w:rFonts w:ascii="Arial" w:hAnsi="Arial" w:cs="Arial"/>
+                <w:noProof/>
+                <w:color w:val="C00000"/>
+                <w:sz w:val="20"/>
+                <w:szCs w:val="20"/>
+              </w:rPr>
+              <w:drawing>
+                <wp:inline distT="0" distB="0" distL="0" distR="0" wp14:anchorId="77F9C60B" wp14:editId="442F959F">
+                  <wp:extent cx="1165860" cy="620395"/>
+                  <wp:effectExtent l="0" t="0" r="0" b="8255"/>
+                  <wp:docPr id="1075637094" name="Picture 1"/>
+                  <wp:cNvGraphicFramePr>
+                    <a:graphicFrameLocks xmlns:a="http://schemas.openxmlformats.org/drawingml/2006/main" noChangeAspect="1"/>
+                  </wp:cNvGraphicFramePr>
+                  <a:graphic xmlns:a="http://schemas.openxmlformats.org/drawingml/2006/main">
+                    <a:graphicData uri="http://schemas.openxmlformats.org/drawingml/2006/picture">
+                      <pic:pic xmlns:pic="http://schemas.openxmlformats.org/drawingml/2006/picture">
+                        <pic:nvPicPr>
+                          <pic:cNvPr id="1075637094" name=""/>
+                          <pic:cNvPicPr/>
+                        </pic:nvPicPr>
+                        <pic:blipFill>
+                          <a:blip r:embed="rId10"/>
+                          <a:stretch>
+                            <a:fillRect/>
+                          </a:stretch>
+                        </pic:blipFill>
+                        <pic:spPr>
+                          <a:xfrm>
+                            <a:off x="0" y="0"/>
+                            <a:ext cx="1165860" cy="620395"/>
+                          </a:xfrm>
+                          <a:prstGeom prst="rect">
+                            <a:avLst/>
+                          </a:prstGeom>
+                        </pic:spPr>
+                      </pic:pic>
+                    </a:graphicData>
+                  </a:graphic>
+                </wp:inline>
+              </w:drawing>
             </w:r>
           </w:p>
         </w:tc>
@@ -1818,7 +1918,107 @@
                 <w:sz w:val="20"/>
                 <w:szCs w:val="20"/>
               </w:rPr>
-              <w:t>Run SELECT slip_type_id, COUNT(*) FROM waitlist_entries WHERE status='WAITING' GROUP BY slip_type_id, and compare each result to the waiting-customer count shown on the page for the matching slip size.</w:t>
+              <w:t xml:space="preserve">Run SELECT </w:t>
+            </w:r>
+            <w:proofErr w:type="spellStart"/>
+            <w:r>
+              <w:rPr>
+                <w:rFonts w:ascii="Arial" w:hAnsi="Arial" w:cs="Arial"/>
+                <w:color w:val="C00000"/>
+                <w:sz w:val="20"/>
+                <w:szCs w:val="20"/>
+              </w:rPr>
+              <w:t>slip_type_id</w:t>
+            </w:r>
+            <w:proofErr w:type="spellEnd"/>
+            <w:r>
+              <w:rPr>
+                <w:rFonts w:ascii="Arial" w:hAnsi="Arial" w:cs="Arial"/>
+                <w:color w:val="C00000"/>
+                <w:sz w:val="20"/>
+                <w:szCs w:val="20"/>
+              </w:rPr>
+              <w:t xml:space="preserve">, </w:t>
+            </w:r>
+            <w:proofErr w:type="gramStart"/>
+            <w:r>
+              <w:rPr>
+                <w:rFonts w:ascii="Arial" w:hAnsi="Arial" w:cs="Arial"/>
+                <w:color w:val="C00000"/>
+                <w:sz w:val="20"/>
+                <w:szCs w:val="20"/>
+              </w:rPr>
+              <w:t>COUNT(</w:t>
+            </w:r>
+            <w:proofErr w:type="gramEnd"/>
+            <w:r>
+              <w:rPr>
+                <w:rFonts w:ascii="Arial" w:hAnsi="Arial" w:cs="Arial"/>
+                <w:color w:val="C00000"/>
+                <w:sz w:val="20"/>
+                <w:szCs w:val="20"/>
+              </w:rPr>
+              <w:t xml:space="preserve">*) FROM </w:t>
+            </w:r>
+            <w:proofErr w:type="spellStart"/>
+            <w:r>
+              <w:rPr>
+                <w:rFonts w:ascii="Arial" w:hAnsi="Arial" w:cs="Arial"/>
+                <w:color w:val="C00000"/>
+                <w:sz w:val="20"/>
+                <w:szCs w:val="20"/>
+              </w:rPr>
+              <w:t>waitlist_entries</w:t>
+            </w:r>
+            <w:proofErr w:type="spellEnd"/>
+            <w:r>
+              <w:rPr>
+                <w:rFonts w:ascii="Arial" w:hAnsi="Arial" w:cs="Arial"/>
+                <w:color w:val="C00000"/>
+                <w:sz w:val="20"/>
+                <w:szCs w:val="20"/>
+              </w:rPr>
+              <w:t xml:space="preserve"> WHERE status='WAITING' GROUP BY </w:t>
+            </w:r>
+            <w:proofErr w:type="spellStart"/>
+            <w:r>
+              <w:rPr>
+                <w:rFonts w:ascii="Arial" w:hAnsi="Arial" w:cs="Arial"/>
+                <w:color w:val="C00000"/>
+                <w:sz w:val="20"/>
+                <w:szCs w:val="20"/>
+              </w:rPr>
+              <w:t>slip_type_</w:t>
+            </w:r>
+            <w:proofErr w:type="gramStart"/>
+            <w:r>
+              <w:rPr>
+                <w:rFonts w:ascii="Arial" w:hAnsi="Arial" w:cs="Arial"/>
+                <w:color w:val="C00000"/>
+                <w:sz w:val="20"/>
+                <w:szCs w:val="20"/>
+              </w:rPr>
+              <w:t>id</w:t>
+            </w:r>
+            <w:proofErr w:type="spellEnd"/>
+            <w:r>
+              <w:rPr>
+                <w:rFonts w:ascii="Arial" w:hAnsi="Arial" w:cs="Arial"/>
+                <w:color w:val="C00000"/>
+                <w:sz w:val="20"/>
+                <w:szCs w:val="20"/>
+              </w:rPr>
+              <w:t>, and</w:t>
+            </w:r>
+            <w:proofErr w:type="gramEnd"/>
+            <w:r>
+              <w:rPr>
+                <w:rFonts w:ascii="Arial" w:hAnsi="Arial" w:cs="Arial"/>
+                <w:color w:val="C00000"/>
+                <w:sz w:val="20"/>
+                <w:szCs w:val="20"/>
+              </w:rPr>
+              <w:t xml:space="preserve"> compare each result to the waiting-customer count shown on the page for the matching slip size.</w:t>
             </w:r>
           </w:p>
         </w:tc>
@@ -1914,7 +2114,7 @@
                           <pic:cNvPicPr/>
                         </pic:nvPicPr>
                         <pic:blipFill>
-                          <a:blip r:embed="rId9">
+                          <a:blip r:embed="rId11">
                             <a:extLst>
                               <a:ext uri="{28A0092B-C50C-407E-A947-70E740481C1C}">
                                 <a14:useLocalDpi xmlns:a14="http://schemas.microsoft.com/office/drawing/2010/main" val="0"/>
@@ -1963,7 +2163,51 @@
                 <w:sz w:val="20"/>
                 <w:szCs w:val="20"/>
               </w:rPr>
-              <w:t>&lt;yes/no&gt;</w:t>
+              <w:t>Yes</w:t>
+            </w:r>
+            <w:r>
+              <w:rPr>
+                <w:rFonts w:ascii="Arial" w:hAnsi="Arial" w:cs="Arial"/>
+                <w:noProof/>
+                <w:color w:val="C00000"/>
+                <w:sz w:val="20"/>
+                <w:szCs w:val="20"/>
+              </w:rPr>
+              <w:drawing>
+                <wp:inline distT="0" distB="0" distL="0" distR="0" wp14:anchorId="0A4DDBE5" wp14:editId="67F983B5">
+                  <wp:extent cx="1165860" cy="619760"/>
+                  <wp:effectExtent l="0" t="0" r="0" b="8890"/>
+                  <wp:docPr id="1955901267" name="Picture 1"/>
+                  <wp:cNvGraphicFramePr>
+                    <a:graphicFrameLocks xmlns:a="http://schemas.openxmlformats.org/drawingml/2006/main" noChangeAspect="1"/>
+                  </wp:cNvGraphicFramePr>
+                  <a:graphic xmlns:a="http://schemas.openxmlformats.org/drawingml/2006/main">
+                    <a:graphicData uri="http://schemas.openxmlformats.org/drawingml/2006/picture">
+                      <pic:pic xmlns:pic="http://schemas.openxmlformats.org/drawingml/2006/picture">
+                        <pic:nvPicPr>
+                          <pic:cNvPr id="1955901267" name=""/>
+                          <pic:cNvPicPr/>
+                        </pic:nvPicPr>
+                        <pic:blipFill>
+                          <a:blip r:embed="rId12"/>
+                          <a:stretch>
+                            <a:fillRect/>
+                          </a:stretch>
+                        </pic:blipFill>
+                        <pic:spPr>
+                          <a:xfrm>
+                            <a:off x="0" y="0"/>
+                            <a:ext cx="1165860" cy="619760"/>
+                          </a:xfrm>
+                          <a:prstGeom prst="rect">
+                            <a:avLst/>
+                          </a:prstGeom>
+                        </pic:spPr>
+                      </pic:pic>
+                    </a:graphicData>
+                  </a:graphic>
+                </wp:inline>
+              </w:drawing>
             </w:r>
           </w:p>
         </w:tc>
@@ -2113,7 +2357,7 @@
                           <pic:cNvPicPr/>
                         </pic:nvPicPr>
                         <pic:blipFill>
-                          <a:blip r:embed="rId10" cstate="print">
+                          <a:blip r:embed="rId13" cstate="print">
                             <a:extLst>
                               <a:ext uri="{28A0092B-C50C-407E-A947-70E740481C1C}">
                                 <a14:useLocalDpi xmlns:a14="http://schemas.microsoft.com/office/drawing/2010/main" val="0"/>
@@ -2173,7 +2417,51 @@
                 <w:sz w:val="20"/>
                 <w:szCs w:val="20"/>
               </w:rPr>
-              <w:t>&lt;yes/no&gt;</w:t>
+              <w:t>Yes</w:t>
+            </w:r>
+            <w:r>
+              <w:rPr>
+                <w:rFonts w:ascii="Arial" w:hAnsi="Arial" w:cs="Arial"/>
+                <w:noProof/>
+                <w:color w:val="C00000"/>
+                <w:sz w:val="20"/>
+                <w:szCs w:val="20"/>
+              </w:rPr>
+              <w:drawing>
+                <wp:inline distT="0" distB="0" distL="0" distR="0" wp14:anchorId="79DFD355" wp14:editId="1ABB4E21">
+                  <wp:extent cx="1165860" cy="735330"/>
+                  <wp:effectExtent l="0" t="0" r="0" b="7620"/>
+                  <wp:docPr id="1721263119" name="Picture 1"/>
+                  <wp:cNvGraphicFramePr>
+                    <a:graphicFrameLocks xmlns:a="http://schemas.openxmlformats.org/drawingml/2006/main" noChangeAspect="1"/>
+                  </wp:cNvGraphicFramePr>
+                  <a:graphic xmlns:a="http://schemas.openxmlformats.org/drawingml/2006/main">
+                    <a:graphicData uri="http://schemas.openxmlformats.org/drawingml/2006/picture">
+                      <pic:pic xmlns:pic="http://schemas.openxmlformats.org/drawingml/2006/picture">
+                        <pic:nvPicPr>
+                          <pic:cNvPr id="594016343" name=""/>
+                          <pic:cNvPicPr/>
+                        </pic:nvPicPr>
+                        <pic:blipFill>
+                          <a:blip r:embed="rId8"/>
+                          <a:stretch>
+                            <a:fillRect/>
+                          </a:stretch>
+                        </pic:blipFill>
+                        <pic:spPr>
+                          <a:xfrm>
+                            <a:off x="0" y="0"/>
+                            <a:ext cx="1165860" cy="735330"/>
+                          </a:xfrm>
+                          <a:prstGeom prst="rect">
+                            <a:avLst/>
+                          </a:prstGeom>
+                        </pic:spPr>
+                      </pic:pic>
+                    </a:graphicData>
+                  </a:graphic>
+                </wp:inline>
+              </w:drawing>
             </w:r>
           </w:p>
         </w:tc>
@@ -2459,7 +2747,7 @@
                           <pic:cNvPicPr/>
                         </pic:nvPicPr>
                         <pic:blipFill>
-                          <a:blip r:embed="rId11" cstate="print">
+                          <a:blip r:embed="rId14" cstate="print">
                             <a:extLst>
                               <a:ext uri="{28A0092B-C50C-407E-A947-70E740481C1C}">
                                 <a14:useLocalDpi xmlns:a14="http://schemas.microsoft.com/office/drawing/2010/main" val="0"/>
@@ -2508,7 +2796,95 @@
                 <w:sz w:val="20"/>
                 <w:szCs w:val="20"/>
               </w:rPr>
-              <w:t>&lt;yes/no&gt;</w:t>
+              <w:t>Yes</w:t>
+            </w:r>
+            <w:r>
+              <w:rPr>
+                <w:rFonts w:ascii="Arial" w:hAnsi="Arial" w:cs="Arial"/>
+                <w:noProof/>
+                <w:color w:val="C00000"/>
+                <w:sz w:val="20"/>
+                <w:szCs w:val="20"/>
+              </w:rPr>
+              <w:drawing>
+                <wp:inline distT="0" distB="0" distL="0" distR="0" wp14:anchorId="6DDC3822" wp14:editId="3462549B">
+                  <wp:extent cx="1165860" cy="728345"/>
+                  <wp:effectExtent l="0" t="0" r="0" b="0"/>
+                  <wp:docPr id="980622545" name="Picture 1"/>
+                  <wp:cNvGraphicFramePr>
+                    <a:graphicFrameLocks xmlns:a="http://schemas.openxmlformats.org/drawingml/2006/main" noChangeAspect="1"/>
+                  </wp:cNvGraphicFramePr>
+                  <a:graphic xmlns:a="http://schemas.openxmlformats.org/drawingml/2006/main">
+                    <a:graphicData uri="http://schemas.openxmlformats.org/drawingml/2006/picture">
+                      <pic:pic xmlns:pic="http://schemas.openxmlformats.org/drawingml/2006/picture">
+                        <pic:nvPicPr>
+                          <pic:cNvPr id="980622545" name=""/>
+                          <pic:cNvPicPr/>
+                        </pic:nvPicPr>
+                        <pic:blipFill>
+                          <a:blip r:embed="rId15"/>
+                          <a:stretch>
+                            <a:fillRect/>
+                          </a:stretch>
+                        </pic:blipFill>
+                        <pic:spPr>
+                          <a:xfrm>
+                            <a:off x="0" y="0"/>
+                            <a:ext cx="1165860" cy="728345"/>
+                          </a:xfrm>
+                          <a:prstGeom prst="rect">
+                            <a:avLst/>
+                          </a:prstGeom>
+                        </pic:spPr>
+                      </pic:pic>
+                    </a:graphicData>
+                  </a:graphic>
+                </wp:inline>
+              </w:drawing>
+            </w:r>
+            <w:r>
+              <w:rPr>
+                <w:rFonts w:ascii="Arial" w:hAnsi="Arial" w:cs="Arial"/>
+                <w:noProof/>
+                <w:color w:val="C00000"/>
+                <w:sz w:val="20"/>
+                <w:szCs w:val="20"/>
+              </w:rPr>
+              <w:drawing>
+                <wp:inline distT="0" distB="0" distL="0" distR="0" wp14:anchorId="021B1F2C" wp14:editId="65879700">
+                  <wp:extent cx="1165860" cy="728345"/>
+                  <wp:effectExtent l="0" t="0" r="0" b="0"/>
+                  <wp:docPr id="158906070" name="Picture 1"/>
+                  <wp:cNvGraphicFramePr>
+                    <a:graphicFrameLocks xmlns:a="http://schemas.openxmlformats.org/drawingml/2006/main" noChangeAspect="1"/>
+                  </wp:cNvGraphicFramePr>
+                  <a:graphic xmlns:a="http://schemas.openxmlformats.org/drawingml/2006/main">
+                    <a:graphicData uri="http://schemas.openxmlformats.org/drawingml/2006/picture">
+                      <pic:pic xmlns:pic="http://schemas.openxmlformats.org/drawingml/2006/picture">
+                        <pic:nvPicPr>
+                          <pic:cNvPr id="158906070" name=""/>
+                          <pic:cNvPicPr/>
+                        </pic:nvPicPr>
+                        <pic:blipFill>
+                          <a:blip r:embed="rId16"/>
+                          <a:stretch>
+                            <a:fillRect/>
+                          </a:stretch>
+                        </pic:blipFill>
+                        <pic:spPr>
+                          <a:xfrm>
+                            <a:off x="0" y="0"/>
+                            <a:ext cx="1165860" cy="728345"/>
+                          </a:xfrm>
+                          <a:prstGeom prst="rect">
+                            <a:avLst/>
+                          </a:prstGeom>
+                        </pic:spPr>
+                      </pic:pic>
+                    </a:graphicData>
+                  </a:graphic>
+                </wp:inline>
+              </w:drawing>
             </w:r>
           </w:p>
         </w:tc>
@@ -2572,26 +2948,6 @@
         </w:tc>
       </w:tr>
     </w:tbl>
-    <w:p>
-      <w:pPr>
-        <w:pStyle w:val="NoSpacing"/>
-        <w:rPr>
-          <w:rFonts w:ascii="Arial" w:hAnsi="Arial" w:cs="Arial"/>
-          <w:sz w:val="24"/>
-          <w:szCs w:val="24"/>
-        </w:rPr>
-      </w:pPr>
-    </w:p>
-    <w:p>
-      <w:pPr>
-        <w:pStyle w:val="NoSpacing"/>
-        <w:rPr>
-          <w:rFonts w:ascii="Arial" w:hAnsi="Arial" w:cs="Arial"/>
-          <w:sz w:val="24"/>
-          <w:szCs w:val="24"/>
-        </w:rPr>
-      </w:pPr>
-    </w:p>
     <w:p>
       <w:pPr>
         <w:pStyle w:val="NoSpacing"/>
@@ -2741,10 +3097,10 @@
       </w:tblPr>
       <w:tblGrid>
         <w:gridCol w:w="1250"/>
-        <w:gridCol w:w="3424"/>
-        <w:gridCol w:w="3180"/>
+        <w:gridCol w:w="3065"/>
+        <w:gridCol w:w="1333"/>
         <w:gridCol w:w="3336"/>
-        <w:gridCol w:w="1760"/>
+        <w:gridCol w:w="3966"/>
       </w:tblGrid>
       <w:tr>
         <w:trPr>
@@ -2825,7 +3181,7 @@
         </w:tc>
         <w:tc>
           <w:tcPr>
-            <w:tcW w:w="3424" w:type="dxa"/>
+            <w:tcW w:w="2435" w:type="dxa"/>
           </w:tcPr>
           <w:p>
             <w:pPr>
@@ -2858,7 +3214,7 @@
         </w:tc>
         <w:tc>
           <w:tcPr>
-            <w:tcW w:w="3180" w:type="dxa"/>
+            <w:tcW w:w="1963" w:type="dxa"/>
           </w:tcPr>
           <w:p>
             <w:pPr>
@@ -2965,7 +3321,7 @@
         </w:tc>
         <w:tc>
           <w:tcPr>
-            <w:tcW w:w="5096" w:type="dxa"/>
+            <w:tcW w:w="7302" w:type="dxa"/>
             <w:gridSpan w:val="2"/>
           </w:tcPr>
           <w:p>
@@ -2988,15 +3344,6 @@
               </w:rPr>
               <w:t xml:space="preserve">Peer tester: </w:t>
             </w:r>
-          </w:p>
-          <w:p>
-            <w:pPr>
-              <w:rPr>
-                <w:rFonts w:ascii="Arial" w:hAnsi="Arial" w:cs="Arial"/>
-                <w:sz w:val="20"/>
-                <w:szCs w:val="20"/>
-              </w:rPr>
-            </w:pPr>
             <w:r>
               <w:rPr>
                 <w:rFonts w:ascii="Arial" w:hAnsi="Arial" w:cs="Arial"/>
@@ -3005,6 +3352,25 @@
                 <w:sz w:val="20"/>
                 <w:szCs w:val="20"/>
               </w:rPr>
+              <w:t>Jordan Dardar</w:t>
+            </w:r>
+          </w:p>
+          <w:p>
+            <w:pPr>
+              <w:rPr>
+                <w:rFonts w:ascii="Arial" w:hAnsi="Arial" w:cs="Arial"/>
+                <w:sz w:val="20"/>
+                <w:szCs w:val="20"/>
+              </w:rPr>
+            </w:pPr>
+            <w:r>
+              <w:rPr>
+                <w:rFonts w:ascii="Arial" w:hAnsi="Arial" w:cs="Arial"/>
+                <w:b/>
+                <w:bCs/>
+                <w:sz w:val="20"/>
+                <w:szCs w:val="20"/>
+              </w:rPr>
               <w:t>Date tested:</w:t>
             </w:r>
             <w:r>
@@ -3022,7 +3388,7 @@
                 <w:sz w:val="20"/>
                 <w:szCs w:val="20"/>
               </w:rPr>
-              <w:t>&lt;yyyy/mm/dd&gt;</w:t>
+              <w:t>2026/09/26</w:t>
             </w:r>
           </w:p>
         </w:tc>
@@ -3060,7 +3426,7 @@
         </w:tc>
         <w:tc>
           <w:tcPr>
-            <w:tcW w:w="3424" w:type="dxa"/>
+            <w:tcW w:w="2435" w:type="dxa"/>
           </w:tcPr>
           <w:p>
             <w:pPr>
@@ -3087,7 +3453,7 @@
         </w:tc>
         <w:tc>
           <w:tcPr>
-            <w:tcW w:w="3180" w:type="dxa"/>
+            <w:tcW w:w="1963" w:type="dxa"/>
           </w:tcPr>
           <w:p>
             <w:pPr>
@@ -3141,7 +3507,7 @@
         </w:tc>
         <w:tc>
           <w:tcPr>
-            <w:tcW w:w="1760" w:type="dxa"/>
+            <w:tcW w:w="3966" w:type="dxa"/>
           </w:tcPr>
           <w:p>
             <w:pPr>
@@ -3196,7 +3562,7 @@
         </w:tc>
         <w:tc>
           <w:tcPr>
-            <w:tcW w:w="3424" w:type="dxa"/>
+            <w:tcW w:w="2435" w:type="dxa"/>
           </w:tcPr>
           <w:p>
             <w:pPr>
@@ -3257,7 +3623,7 @@
         </w:tc>
         <w:tc>
           <w:tcPr>
-            <w:tcW w:w="3180" w:type="dxa"/>
+            <w:tcW w:w="1963" w:type="dxa"/>
           </w:tcPr>
           <w:p>
             <w:pPr>
@@ -3347,7 +3713,7 @@
                           <pic:cNvPicPr/>
                         </pic:nvPicPr>
                         <pic:blipFill>
-                          <a:blip r:embed="rId12" cstate="print">
+                          <a:blip r:embed="rId17" cstate="print">
                             <a:extLst>
                               <a:ext uri="{28A0092B-C50C-407E-A947-70E740481C1C}">
                                 <a14:useLocalDpi xmlns:a14="http://schemas.microsoft.com/office/drawing/2010/main" val="0"/>
@@ -3377,26 +3743,70 @@
         </w:tc>
         <w:tc>
           <w:tcPr>
-            <w:tcW w:w="1760" w:type="dxa"/>
-          </w:tcPr>
-          <w:p>
-            <w:pPr>
-              <w:spacing w:before="80" w:after="80"/>
-              <w:rPr>
-                <w:rFonts w:ascii="Arial" w:hAnsi="Arial" w:cs="Arial"/>
-                <w:color w:val="C00000"/>
-                <w:sz w:val="20"/>
-                <w:szCs w:val="20"/>
-              </w:rPr>
-            </w:pPr>
-            <w:r>
-              <w:rPr>
-                <w:rFonts w:ascii="Arial" w:hAnsi="Arial" w:cs="Arial"/>
-                <w:color w:val="C00000"/>
-                <w:sz w:val="20"/>
-                <w:szCs w:val="20"/>
-              </w:rPr>
-              <w:t>&lt;yes/no&gt;</w:t>
+            <w:tcW w:w="3966" w:type="dxa"/>
+          </w:tcPr>
+          <w:p>
+            <w:pPr>
+              <w:spacing w:before="80" w:after="80"/>
+              <w:rPr>
+                <w:rFonts w:ascii="Arial" w:hAnsi="Arial" w:cs="Arial"/>
+                <w:color w:val="C00000"/>
+                <w:sz w:val="20"/>
+                <w:szCs w:val="20"/>
+              </w:rPr>
+            </w:pPr>
+            <w:r>
+              <w:rPr>
+                <w:rFonts w:ascii="Arial" w:hAnsi="Arial" w:cs="Arial"/>
+                <w:color w:val="C00000"/>
+                <w:sz w:val="20"/>
+                <w:szCs w:val="20"/>
+              </w:rPr>
+              <w:t>Yes</w:t>
+            </w:r>
+            <w:r>
+              <w:rPr>
+                <w:rFonts w:ascii="Arial" w:hAnsi="Arial" w:cs="Arial"/>
+                <w:noProof/>
+                <w:color w:val="C00000"/>
+                <w:sz w:val="20"/>
+                <w:szCs w:val="20"/>
+              </w:rPr>
+              <w:drawing>
+                <wp:inline distT="0" distB="0" distL="0" distR="0" wp14:anchorId="710DD412" wp14:editId="28D9D0A6">
+                  <wp:extent cx="1644757" cy="1029496"/>
+                  <wp:effectExtent l="0" t="0" r="0" b="0"/>
+                  <wp:docPr id="1898559611" name="Picture 1"/>
+                  <wp:cNvGraphicFramePr>
+                    <a:graphicFrameLocks xmlns:a="http://schemas.openxmlformats.org/drawingml/2006/main" noChangeAspect="1"/>
+                  </wp:cNvGraphicFramePr>
+                  <a:graphic xmlns:a="http://schemas.openxmlformats.org/drawingml/2006/main">
+                    <a:graphicData uri="http://schemas.openxmlformats.org/drawingml/2006/picture">
+                      <pic:pic xmlns:pic="http://schemas.openxmlformats.org/drawingml/2006/picture">
+                        <pic:nvPicPr>
+                          <pic:cNvPr id="1898559611" name=""/>
+                          <pic:cNvPicPr/>
+                        </pic:nvPicPr>
+                        <pic:blipFill>
+                          <a:blip r:embed="rId18"/>
+                          <a:stretch>
+                            <a:fillRect/>
+                          </a:stretch>
+                        </pic:blipFill>
+                        <pic:spPr>
+                          <a:xfrm>
+                            <a:off x="0" y="0"/>
+                            <a:ext cx="1662583" cy="1040654"/>
+                          </a:xfrm>
+                          <a:prstGeom prst="rect">
+                            <a:avLst/>
+                          </a:prstGeom>
+                        </pic:spPr>
+                      </pic:pic>
+                    </a:graphicData>
+                  </a:graphic>
+                </wp:inline>
+              </w:drawing>
             </w:r>
           </w:p>
         </w:tc>
@@ -3424,13 +3834,14 @@
                 <w:sz w:val="20"/>
                 <w:szCs w:val="20"/>
               </w:rPr>
+              <w:lastRenderedPageBreak/>
               <w:t>2</w:t>
             </w:r>
           </w:p>
         </w:tc>
         <w:tc>
           <w:tcPr>
-            <w:tcW w:w="3424" w:type="dxa"/>
+            <w:tcW w:w="2435" w:type="dxa"/>
           </w:tcPr>
           <w:p>
             <w:pPr>
@@ -3455,7 +3866,7 @@
         </w:tc>
         <w:tc>
           <w:tcPr>
-            <w:tcW w:w="3180" w:type="dxa"/>
+            <w:tcW w:w="1963" w:type="dxa"/>
           </w:tcPr>
           <w:p>
             <w:pPr>
@@ -3545,7 +3956,7 @@
                           <pic:cNvPicPr/>
                         </pic:nvPicPr>
                         <pic:blipFill>
-                          <a:blip r:embed="rId13" cstate="print">
+                          <a:blip r:embed="rId19" cstate="print">
                             <a:extLst>
                               <a:ext uri="{28A0092B-C50C-407E-A947-70E740481C1C}">
                                 <a14:useLocalDpi xmlns:a14="http://schemas.microsoft.com/office/drawing/2010/main" val="0"/>
@@ -3575,26 +3986,70 @@
         </w:tc>
         <w:tc>
           <w:tcPr>
-            <w:tcW w:w="1760" w:type="dxa"/>
-          </w:tcPr>
-          <w:p>
-            <w:pPr>
-              <w:spacing w:before="80" w:after="80"/>
-              <w:rPr>
-                <w:rFonts w:ascii="Arial" w:hAnsi="Arial" w:cs="Arial"/>
-                <w:color w:val="C00000"/>
-                <w:sz w:val="20"/>
-                <w:szCs w:val="20"/>
-              </w:rPr>
-            </w:pPr>
-            <w:r>
-              <w:rPr>
-                <w:rFonts w:ascii="Arial" w:hAnsi="Arial" w:cs="Arial"/>
-                <w:color w:val="C00000"/>
-                <w:sz w:val="20"/>
-                <w:szCs w:val="20"/>
-              </w:rPr>
-              <w:t>&lt;yes/no&gt;</w:t>
+            <w:tcW w:w="3966" w:type="dxa"/>
+          </w:tcPr>
+          <w:p>
+            <w:pPr>
+              <w:spacing w:before="80" w:after="80"/>
+              <w:rPr>
+                <w:rFonts w:ascii="Arial" w:hAnsi="Arial" w:cs="Arial"/>
+                <w:color w:val="C00000"/>
+                <w:sz w:val="20"/>
+                <w:szCs w:val="20"/>
+              </w:rPr>
+            </w:pPr>
+            <w:r>
+              <w:rPr>
+                <w:rFonts w:ascii="Arial" w:hAnsi="Arial" w:cs="Arial"/>
+                <w:color w:val="C00000"/>
+                <w:sz w:val="20"/>
+                <w:szCs w:val="20"/>
+              </w:rPr>
+              <w:t>Yes</w:t>
+            </w:r>
+            <w:r>
+              <w:rPr>
+                <w:rFonts w:ascii="Arial" w:hAnsi="Arial" w:cs="Arial"/>
+                <w:noProof/>
+                <w:color w:val="C00000"/>
+                <w:sz w:val="20"/>
+                <w:szCs w:val="20"/>
+              </w:rPr>
+              <w:drawing>
+                <wp:inline distT="0" distB="0" distL="0" distR="0" wp14:anchorId="2740257F" wp14:editId="3C25CED3">
+                  <wp:extent cx="2071076" cy="1293623"/>
+                  <wp:effectExtent l="0" t="0" r="5715" b="1905"/>
+                  <wp:docPr id="647861562" name="Picture 1"/>
+                  <wp:cNvGraphicFramePr>
+                    <a:graphicFrameLocks xmlns:a="http://schemas.openxmlformats.org/drawingml/2006/main" noChangeAspect="1"/>
+                  </wp:cNvGraphicFramePr>
+                  <a:graphic xmlns:a="http://schemas.openxmlformats.org/drawingml/2006/main">
+                    <a:graphicData uri="http://schemas.openxmlformats.org/drawingml/2006/picture">
+                      <pic:pic xmlns:pic="http://schemas.openxmlformats.org/drawingml/2006/picture">
+                        <pic:nvPicPr>
+                          <pic:cNvPr id="647861562" name=""/>
+                          <pic:cNvPicPr/>
+                        </pic:nvPicPr>
+                        <pic:blipFill>
+                          <a:blip r:embed="rId20"/>
+                          <a:stretch>
+                            <a:fillRect/>
+                          </a:stretch>
+                        </pic:blipFill>
+                        <pic:spPr>
+                          <a:xfrm>
+                            <a:off x="0" y="0"/>
+                            <a:ext cx="2082226" cy="1300587"/>
+                          </a:xfrm>
+                          <a:prstGeom prst="rect">
+                            <a:avLst/>
+                          </a:prstGeom>
+                        </pic:spPr>
+                      </pic:pic>
+                    </a:graphicData>
+                  </a:graphic>
+                </wp:inline>
+              </w:drawing>
             </w:r>
           </w:p>
         </w:tc>
@@ -3628,7 +4083,7 @@
         </w:tc>
         <w:tc>
           <w:tcPr>
-            <w:tcW w:w="3424" w:type="dxa"/>
+            <w:tcW w:w="2435" w:type="dxa"/>
           </w:tcPr>
           <w:p>
             <w:pPr>
@@ -3653,7 +4108,7 @@
         </w:tc>
         <w:tc>
           <w:tcPr>
-            <w:tcW w:w="3180" w:type="dxa"/>
+            <w:tcW w:w="1963" w:type="dxa"/>
           </w:tcPr>
           <w:p>
             <w:pPr>
@@ -3743,7 +4198,7 @@
                           <pic:cNvPicPr/>
                         </pic:nvPicPr>
                         <pic:blipFill>
-                          <a:blip r:embed="rId14" cstate="print">
+                          <a:blip r:embed="rId21" cstate="print">
                             <a:extLst>
                               <a:ext uri="{28A0092B-C50C-407E-A947-70E740481C1C}">
                                 <a14:useLocalDpi xmlns:a14="http://schemas.microsoft.com/office/drawing/2010/main" val="0"/>
@@ -3773,26 +4228,70 @@
         </w:tc>
         <w:tc>
           <w:tcPr>
-            <w:tcW w:w="1760" w:type="dxa"/>
-          </w:tcPr>
-          <w:p>
-            <w:pPr>
-              <w:spacing w:before="80" w:after="80"/>
-              <w:rPr>
-                <w:rFonts w:ascii="Arial" w:hAnsi="Arial" w:cs="Arial"/>
-                <w:color w:val="C00000"/>
-                <w:sz w:val="20"/>
-                <w:szCs w:val="20"/>
-              </w:rPr>
-            </w:pPr>
-            <w:r>
-              <w:rPr>
-                <w:rFonts w:ascii="Arial" w:hAnsi="Arial" w:cs="Arial"/>
-                <w:color w:val="C00000"/>
-                <w:sz w:val="20"/>
-                <w:szCs w:val="20"/>
-              </w:rPr>
-              <w:t>&lt;yes/no&gt;</w:t>
+            <w:tcW w:w="3966" w:type="dxa"/>
+          </w:tcPr>
+          <w:p>
+            <w:pPr>
+              <w:spacing w:before="80" w:after="80"/>
+              <w:rPr>
+                <w:rFonts w:ascii="Arial" w:hAnsi="Arial" w:cs="Arial"/>
+                <w:color w:val="C00000"/>
+                <w:sz w:val="20"/>
+                <w:szCs w:val="20"/>
+              </w:rPr>
+            </w:pPr>
+            <w:r>
+              <w:rPr>
+                <w:rFonts w:ascii="Arial" w:hAnsi="Arial" w:cs="Arial"/>
+                <w:color w:val="C00000"/>
+                <w:sz w:val="20"/>
+                <w:szCs w:val="20"/>
+              </w:rPr>
+              <w:t>Yes</w:t>
+            </w:r>
+            <w:r>
+              <w:rPr>
+                <w:rFonts w:ascii="Arial" w:hAnsi="Arial" w:cs="Arial"/>
+                <w:noProof/>
+                <w:color w:val="C00000"/>
+                <w:sz w:val="20"/>
+                <w:szCs w:val="20"/>
+              </w:rPr>
+              <w:drawing>
+                <wp:inline distT="0" distB="0" distL="0" distR="0" wp14:anchorId="57B9625E" wp14:editId="4A75B364">
+                  <wp:extent cx="2313353" cy="1444953"/>
+                  <wp:effectExtent l="0" t="0" r="0" b="3175"/>
+                  <wp:docPr id="1792955176" name="Picture 1"/>
+                  <wp:cNvGraphicFramePr>
+                    <a:graphicFrameLocks xmlns:a="http://schemas.openxmlformats.org/drawingml/2006/main" noChangeAspect="1"/>
+                  </wp:cNvGraphicFramePr>
+                  <a:graphic xmlns:a="http://schemas.openxmlformats.org/drawingml/2006/main">
+                    <a:graphicData uri="http://schemas.openxmlformats.org/drawingml/2006/picture">
+                      <pic:pic xmlns:pic="http://schemas.openxmlformats.org/drawingml/2006/picture">
+                        <pic:nvPicPr>
+                          <pic:cNvPr id="1792955176" name=""/>
+                          <pic:cNvPicPr/>
+                        </pic:nvPicPr>
+                        <pic:blipFill>
+                          <a:blip r:embed="rId22"/>
+                          <a:stretch>
+                            <a:fillRect/>
+                          </a:stretch>
+                        </pic:blipFill>
+                        <pic:spPr>
+                          <a:xfrm>
+                            <a:off x="0" y="0"/>
+                            <a:ext cx="2329557" cy="1455074"/>
+                          </a:xfrm>
+                          <a:prstGeom prst="rect">
+                            <a:avLst/>
+                          </a:prstGeom>
+                        </pic:spPr>
+                      </pic:pic>
+                    </a:graphicData>
+                  </a:graphic>
+                </wp:inline>
+              </w:drawing>
             </w:r>
           </w:p>
         </w:tc>
@@ -3827,51 +4326,151 @@
         </w:tc>
         <w:tc>
           <w:tcPr>
-            <w:tcW w:w="3424" w:type="dxa"/>
-          </w:tcPr>
-          <w:p>
-            <w:pPr>
-              <w:spacing w:before="80" w:after="80"/>
-              <w:rPr>
-                <w:rFonts w:ascii="Arial" w:hAnsi="Arial" w:cs="Arial"/>
-                <w:color w:val="C00000"/>
-                <w:sz w:val="20"/>
-                <w:szCs w:val="20"/>
-              </w:rPr>
-            </w:pPr>
-            <w:r>
-              <w:rPr>
-                <w:rFonts w:ascii="Arial" w:hAnsi="Arial" w:cs="Arial"/>
-                <w:color w:val="C00000"/>
-                <w:sz w:val="20"/>
-                <w:szCs w:val="20"/>
-              </w:rPr>
-              <w:t>Query the database directly: SELECT * FROM waitlist_entries WHERE customer_id = &lt;that customer's id&gt;.</w:t>
-            </w:r>
-          </w:p>
-        </w:tc>
-        <w:tc>
-          <w:tcPr>
-            <w:tcW w:w="3180" w:type="dxa"/>
-          </w:tcPr>
-          <w:p>
-            <w:pPr>
-              <w:spacing w:before="80" w:after="80"/>
-              <w:rPr>
-                <w:rFonts w:ascii="Arial" w:hAnsi="Arial" w:cs="Arial"/>
-                <w:color w:val="C00000"/>
-                <w:sz w:val="20"/>
-                <w:szCs w:val="20"/>
-              </w:rPr>
-            </w:pPr>
-            <w:r>
-              <w:rPr>
-                <w:rFonts w:ascii="Arial" w:hAnsi="Arial" w:cs="Arial"/>
-                <w:color w:val="C00000"/>
-                <w:sz w:val="20"/>
-                <w:szCs w:val="20"/>
-              </w:rPr>
-              <w:t>Exactly one new row exists for that customer with the correct boat_id, slip_type_id, status = 'WAITING', and a joined_at timestamp.</w:t>
+            <w:tcW w:w="2435" w:type="dxa"/>
+          </w:tcPr>
+          <w:p>
+            <w:pPr>
+              <w:spacing w:before="80" w:after="80"/>
+              <w:rPr>
+                <w:rFonts w:ascii="Arial" w:hAnsi="Arial" w:cs="Arial"/>
+                <w:color w:val="C00000"/>
+                <w:sz w:val="20"/>
+                <w:szCs w:val="20"/>
+              </w:rPr>
+            </w:pPr>
+            <w:r>
+              <w:rPr>
+                <w:rFonts w:ascii="Arial" w:hAnsi="Arial" w:cs="Arial"/>
+                <w:color w:val="C00000"/>
+                <w:sz w:val="20"/>
+                <w:szCs w:val="20"/>
+              </w:rPr>
+              <w:t xml:space="preserve">Query the database directly: SELECT * FROM </w:t>
+            </w:r>
+            <w:proofErr w:type="spellStart"/>
+            <w:r>
+              <w:rPr>
+                <w:rFonts w:ascii="Arial" w:hAnsi="Arial" w:cs="Arial"/>
+                <w:color w:val="C00000"/>
+                <w:sz w:val="20"/>
+                <w:szCs w:val="20"/>
+              </w:rPr>
+              <w:t>waitlist_entries</w:t>
+            </w:r>
+            <w:proofErr w:type="spellEnd"/>
+            <w:r>
+              <w:rPr>
+                <w:rFonts w:ascii="Arial" w:hAnsi="Arial" w:cs="Arial"/>
+                <w:color w:val="C00000"/>
+                <w:sz w:val="20"/>
+                <w:szCs w:val="20"/>
+              </w:rPr>
+              <w:t xml:space="preserve"> WHERE </w:t>
+            </w:r>
+            <w:proofErr w:type="spellStart"/>
+            <w:r>
+              <w:rPr>
+                <w:rFonts w:ascii="Arial" w:hAnsi="Arial" w:cs="Arial"/>
+                <w:color w:val="C00000"/>
+                <w:sz w:val="20"/>
+                <w:szCs w:val="20"/>
+              </w:rPr>
+              <w:t>customer_id</w:t>
+            </w:r>
+            <w:proofErr w:type="spellEnd"/>
+            <w:r>
+              <w:rPr>
+                <w:rFonts w:ascii="Arial" w:hAnsi="Arial" w:cs="Arial"/>
+                <w:color w:val="C00000"/>
+                <w:sz w:val="20"/>
+                <w:szCs w:val="20"/>
+              </w:rPr>
+              <w:t xml:space="preserve"> = &lt;that customer's id&gt;.</w:t>
+            </w:r>
+          </w:p>
+        </w:tc>
+        <w:tc>
+          <w:tcPr>
+            <w:tcW w:w="1963" w:type="dxa"/>
+          </w:tcPr>
+          <w:p>
+            <w:pPr>
+              <w:spacing w:before="80" w:after="80"/>
+              <w:rPr>
+                <w:rFonts w:ascii="Arial" w:hAnsi="Arial" w:cs="Arial"/>
+                <w:color w:val="C00000"/>
+                <w:sz w:val="20"/>
+                <w:szCs w:val="20"/>
+              </w:rPr>
+            </w:pPr>
+            <w:r>
+              <w:rPr>
+                <w:rFonts w:ascii="Arial" w:hAnsi="Arial" w:cs="Arial"/>
+                <w:color w:val="C00000"/>
+                <w:sz w:val="20"/>
+                <w:szCs w:val="20"/>
+              </w:rPr>
+              <w:t xml:space="preserve">Exactly one new row exists for that customer with the correct </w:t>
+            </w:r>
+            <w:proofErr w:type="spellStart"/>
+            <w:r>
+              <w:rPr>
+                <w:rFonts w:ascii="Arial" w:hAnsi="Arial" w:cs="Arial"/>
+                <w:color w:val="C00000"/>
+                <w:sz w:val="20"/>
+                <w:szCs w:val="20"/>
+              </w:rPr>
+              <w:t>boat_id</w:t>
+            </w:r>
+            <w:proofErr w:type="spellEnd"/>
+            <w:r>
+              <w:rPr>
+                <w:rFonts w:ascii="Arial" w:hAnsi="Arial" w:cs="Arial"/>
+                <w:color w:val="C00000"/>
+                <w:sz w:val="20"/>
+                <w:szCs w:val="20"/>
+              </w:rPr>
+              <w:t xml:space="preserve">, </w:t>
+            </w:r>
+            <w:proofErr w:type="spellStart"/>
+            <w:r>
+              <w:rPr>
+                <w:rFonts w:ascii="Arial" w:hAnsi="Arial" w:cs="Arial"/>
+                <w:color w:val="C00000"/>
+                <w:sz w:val="20"/>
+                <w:szCs w:val="20"/>
+              </w:rPr>
+              <w:t>slip_type_id</w:t>
+            </w:r>
+            <w:proofErr w:type="spellEnd"/>
+            <w:r>
+              <w:rPr>
+                <w:rFonts w:ascii="Arial" w:hAnsi="Arial" w:cs="Arial"/>
+                <w:color w:val="C00000"/>
+                <w:sz w:val="20"/>
+                <w:szCs w:val="20"/>
+              </w:rPr>
+              <w:t xml:space="preserve">, status = 'WAITING', and a </w:t>
+            </w:r>
+            <w:proofErr w:type="spellStart"/>
+            <w:r>
+              <w:rPr>
+                <w:rFonts w:ascii="Arial" w:hAnsi="Arial" w:cs="Arial"/>
+                <w:color w:val="C00000"/>
+                <w:sz w:val="20"/>
+                <w:szCs w:val="20"/>
+              </w:rPr>
+              <w:t>joined_at</w:t>
+            </w:r>
+            <w:proofErr w:type="spellEnd"/>
+            <w:r>
+              <w:rPr>
+                <w:rFonts w:ascii="Arial" w:hAnsi="Arial" w:cs="Arial"/>
+                <w:color w:val="C00000"/>
+                <w:sz w:val="20"/>
+                <w:szCs w:val="20"/>
+              </w:rPr>
+              <w:t xml:space="preserve"> timestamp.</w:t>
             </w:r>
           </w:p>
         </w:tc>
@@ -3927,7 +4526,7 @@
                 <w:szCs w:val="20"/>
               </w:rPr>
               <w:drawing>
-                <wp:inline distT="0" distB="0" distL="0" distR="0" wp14:anchorId="2FBD51A1" wp14:editId="3398512D">
+                <wp:inline distT="0" distB="0" distL="0" distR="0" wp14:anchorId="2FBD51A1" wp14:editId="5714B2FD">
                   <wp:extent cx="1692266" cy="640080"/>
                   <wp:effectExtent l="0" t="0" r="3810" b="7620"/>
                   <wp:docPr id="287354403" name="Picture 9"/>
@@ -3942,7 +4541,7 @@
                           <pic:cNvPicPr/>
                         </pic:nvPicPr>
                         <pic:blipFill>
-                          <a:blip r:embed="rId15" cstate="print">
+                          <a:blip r:embed="rId23" cstate="print">
                             <a:extLst>
                               <a:ext uri="{28A0092B-C50C-407E-A947-70E740481C1C}">
                                 <a14:useLocalDpi xmlns:a14="http://schemas.microsoft.com/office/drawing/2010/main" val="0"/>
@@ -3972,26 +4571,70 @@
         </w:tc>
         <w:tc>
           <w:tcPr>
-            <w:tcW w:w="1760" w:type="dxa"/>
-          </w:tcPr>
-          <w:p>
-            <w:pPr>
-              <w:spacing w:before="80" w:after="80"/>
-              <w:rPr>
-                <w:rFonts w:ascii="Arial" w:hAnsi="Arial" w:cs="Arial"/>
-                <w:color w:val="C00000"/>
-                <w:sz w:val="20"/>
-                <w:szCs w:val="20"/>
-              </w:rPr>
-            </w:pPr>
-            <w:r>
-              <w:rPr>
-                <w:rFonts w:ascii="Arial" w:hAnsi="Arial" w:cs="Arial"/>
-                <w:color w:val="C00000"/>
-                <w:sz w:val="20"/>
-                <w:szCs w:val="20"/>
-              </w:rPr>
-              <w:t>&lt;yes/no&gt;</w:t>
+            <w:tcW w:w="3966" w:type="dxa"/>
+          </w:tcPr>
+          <w:p>
+            <w:pPr>
+              <w:spacing w:before="80" w:after="80"/>
+              <w:rPr>
+                <w:rFonts w:ascii="Arial" w:hAnsi="Arial" w:cs="Arial"/>
+                <w:color w:val="C00000"/>
+                <w:sz w:val="20"/>
+                <w:szCs w:val="20"/>
+              </w:rPr>
+            </w:pPr>
+            <w:r>
+              <w:rPr>
+                <w:rFonts w:ascii="Arial" w:hAnsi="Arial" w:cs="Arial"/>
+                <w:color w:val="C00000"/>
+                <w:sz w:val="20"/>
+                <w:szCs w:val="20"/>
+              </w:rPr>
+              <w:t>Yes</w:t>
+            </w:r>
+            <w:r>
+              <w:rPr>
+                <w:rFonts w:ascii="Arial" w:hAnsi="Arial" w:cs="Arial"/>
+                <w:noProof/>
+                <w:color w:val="C00000"/>
+                <w:sz w:val="20"/>
+                <w:szCs w:val="20"/>
+              </w:rPr>
+              <w:drawing>
+                <wp:inline distT="0" distB="0" distL="0" distR="0" wp14:anchorId="6D4E29D2" wp14:editId="0009D67F">
+                  <wp:extent cx="2375876" cy="392313"/>
+                  <wp:effectExtent l="0" t="0" r="5715" b="8255"/>
+                  <wp:docPr id="584193725" name="Picture 1"/>
+                  <wp:cNvGraphicFramePr>
+                    <a:graphicFrameLocks xmlns:a="http://schemas.openxmlformats.org/drawingml/2006/main" noChangeAspect="1"/>
+                  </wp:cNvGraphicFramePr>
+                  <a:graphic xmlns:a="http://schemas.openxmlformats.org/drawingml/2006/main">
+                    <a:graphicData uri="http://schemas.openxmlformats.org/drawingml/2006/picture">
+                      <pic:pic xmlns:pic="http://schemas.openxmlformats.org/drawingml/2006/picture">
+                        <pic:nvPicPr>
+                          <pic:cNvPr id="584193725" name=""/>
+                          <pic:cNvPicPr/>
+                        </pic:nvPicPr>
+                        <pic:blipFill>
+                          <a:blip r:embed="rId24"/>
+                          <a:stretch>
+                            <a:fillRect/>
+                          </a:stretch>
+                        </pic:blipFill>
+                        <pic:spPr>
+                          <a:xfrm>
+                            <a:off x="0" y="0"/>
+                            <a:ext cx="2424746" cy="400383"/>
+                          </a:xfrm>
+                          <a:prstGeom prst="rect">
+                            <a:avLst/>
+                          </a:prstGeom>
+                        </pic:spPr>
+                      </pic:pic>
+                    </a:graphicData>
+                  </a:graphic>
+                </wp:inline>
+              </w:drawing>
             </w:r>
           </w:p>
         </w:tc>
@@ -4025,7 +4668,7 @@
         </w:tc>
         <w:tc>
           <w:tcPr>
-            <w:tcW w:w="3424" w:type="dxa"/>
+            <w:tcW w:w="2435" w:type="dxa"/>
           </w:tcPr>
           <w:p>
             <w:pPr>
@@ -4050,7 +4693,7 @@
         </w:tc>
         <w:tc>
           <w:tcPr>
-            <w:tcW w:w="3180" w:type="dxa"/>
+            <w:tcW w:w="1963" w:type="dxa"/>
           </w:tcPr>
           <w:p>
             <w:pPr>
@@ -4140,7 +4783,7 @@
                           <pic:cNvPicPr/>
                         </pic:nvPicPr>
                         <pic:blipFill>
-                          <a:blip r:embed="rId16" cstate="print">
+                          <a:blip r:embed="rId25" cstate="print">
                             <a:extLst>
                               <a:ext uri="{28A0092B-C50C-407E-A947-70E740481C1C}">
                                 <a14:useLocalDpi xmlns:a14="http://schemas.microsoft.com/office/drawing/2010/main" val="0"/>
@@ -4170,26 +4813,70 @@
         </w:tc>
         <w:tc>
           <w:tcPr>
-            <w:tcW w:w="1760" w:type="dxa"/>
-          </w:tcPr>
-          <w:p>
-            <w:pPr>
-              <w:spacing w:before="80" w:after="80"/>
-              <w:rPr>
-                <w:rFonts w:ascii="Arial" w:hAnsi="Arial" w:cs="Arial"/>
-                <w:color w:val="C00000"/>
-                <w:sz w:val="20"/>
-                <w:szCs w:val="20"/>
-              </w:rPr>
-            </w:pPr>
-            <w:r>
-              <w:rPr>
-                <w:rFonts w:ascii="Arial" w:hAnsi="Arial" w:cs="Arial"/>
-                <w:color w:val="C00000"/>
-                <w:sz w:val="20"/>
-                <w:szCs w:val="20"/>
-              </w:rPr>
-              <w:t>&lt;yes/no&gt;</w:t>
+            <w:tcW w:w="3966" w:type="dxa"/>
+          </w:tcPr>
+          <w:p>
+            <w:pPr>
+              <w:spacing w:before="80" w:after="80"/>
+              <w:rPr>
+                <w:rFonts w:ascii="Arial" w:hAnsi="Arial" w:cs="Arial"/>
+                <w:color w:val="C00000"/>
+                <w:sz w:val="20"/>
+                <w:szCs w:val="20"/>
+              </w:rPr>
+            </w:pPr>
+            <w:r>
+              <w:rPr>
+                <w:rFonts w:ascii="Arial" w:hAnsi="Arial" w:cs="Arial"/>
+                <w:color w:val="C00000"/>
+                <w:sz w:val="20"/>
+                <w:szCs w:val="20"/>
+              </w:rPr>
+              <w:t>Yes</w:t>
+            </w:r>
+            <w:r>
+              <w:rPr>
+                <w:rFonts w:ascii="Arial" w:hAnsi="Arial" w:cs="Arial"/>
+                <w:noProof/>
+                <w:color w:val="C00000"/>
+                <w:sz w:val="20"/>
+                <w:szCs w:val="20"/>
+              </w:rPr>
+              <w:drawing>
+                <wp:inline distT="0" distB="0" distL="0" distR="0" wp14:anchorId="6FC8F1A1" wp14:editId="506C494A">
+                  <wp:extent cx="2273611" cy="1420130"/>
+                  <wp:effectExtent l="0" t="0" r="0" b="8890"/>
+                  <wp:docPr id="1254380237" name="Picture 1"/>
+                  <wp:cNvGraphicFramePr>
+                    <a:graphicFrameLocks xmlns:a="http://schemas.openxmlformats.org/drawingml/2006/main" noChangeAspect="1"/>
+                  </wp:cNvGraphicFramePr>
+                  <a:graphic xmlns:a="http://schemas.openxmlformats.org/drawingml/2006/main">
+                    <a:graphicData uri="http://schemas.openxmlformats.org/drawingml/2006/picture">
+                      <pic:pic xmlns:pic="http://schemas.openxmlformats.org/drawingml/2006/picture">
+                        <pic:nvPicPr>
+                          <pic:cNvPr id="1254380237" name=""/>
+                          <pic:cNvPicPr/>
+                        </pic:nvPicPr>
+                        <pic:blipFill>
+                          <a:blip r:embed="rId26"/>
+                          <a:stretch>
+                            <a:fillRect/>
+                          </a:stretch>
+                        </pic:blipFill>
+                        <pic:spPr>
+                          <a:xfrm>
+                            <a:off x="0" y="0"/>
+                            <a:ext cx="2294577" cy="1433225"/>
+                          </a:xfrm>
+                          <a:prstGeom prst="rect">
+                            <a:avLst/>
+                          </a:prstGeom>
+                        </pic:spPr>
+                      </pic:pic>
+                    </a:graphicData>
+                  </a:graphic>
+                </wp:inline>
+              </w:drawing>
             </w:r>
           </w:p>
         </w:tc>
@@ -4263,1252 +4950,9 @@
         </w:rPr>
       </w:pPr>
     </w:p>
-    <w:p>
-      <w:pPr>
-        <w:pStyle w:val="NoSpacing"/>
-        <w:rPr>
-          <w:rFonts w:ascii="Arial" w:hAnsi="Arial" w:cs="Arial"/>
-          <w:sz w:val="24"/>
-          <w:szCs w:val="24"/>
-        </w:rPr>
-      </w:pPr>
-    </w:p>
-    <w:p>
-      <w:pPr>
-        <w:pStyle w:val="NoSpacing"/>
-        <w:rPr>
-          <w:rFonts w:ascii="Arial" w:hAnsi="Arial" w:cs="Arial"/>
-          <w:sz w:val="24"/>
-          <w:szCs w:val="24"/>
-        </w:rPr>
-      </w:pPr>
-    </w:p>
-    <w:p>
-      <w:pPr>
-        <w:pStyle w:val="NoSpacing"/>
-        <w:rPr>
-          <w:rFonts w:ascii="Arial" w:hAnsi="Arial" w:cs="Arial"/>
-          <w:color w:val="EE0000"/>
-          <w:sz w:val="24"/>
-          <w:szCs w:val="24"/>
-        </w:rPr>
-      </w:pPr>
-      <w:r>
-        <w:rPr>
-          <w:rFonts w:ascii="Arial" w:hAnsi="Arial" w:cs="Arial"/>
-          <w:color w:val="EE0000"/>
-          <w:sz w:val="24"/>
-          <w:szCs w:val="24"/>
-        </w:rPr>
-        <w:t xml:space="preserve">Scripts used: </w:t>
-      </w:r>
-    </w:p>
-    <w:p>
-      <w:pPr>
-        <w:pStyle w:val="NoSpacing"/>
-        <w:rPr>
-          <w:rFonts w:ascii="Arial" w:hAnsi="Arial" w:cs="Arial"/>
-          <w:sz w:val="24"/>
-          <w:szCs w:val="24"/>
-        </w:rPr>
-      </w:pPr>
-      <w:r>
-        <w:rPr>
-          <w:rFonts w:ascii="Arial" w:hAnsi="Arial" w:cs="Arial"/>
-          <w:sz w:val="24"/>
-          <w:szCs w:val="24"/>
-        </w:rPr>
-        <w:t xml:space="preserve">SELECT </w:t>
-      </w:r>
-      <w:proofErr w:type="spellStart"/>
-      <w:proofErr w:type="gramStart"/>
-      <w:r>
-        <w:rPr>
-          <w:rFonts w:ascii="Arial" w:hAnsi="Arial" w:cs="Arial"/>
-          <w:sz w:val="24"/>
-          <w:szCs w:val="24"/>
-        </w:rPr>
-        <w:t>st.size</w:t>
-      </w:r>
-      <w:proofErr w:type="gramEnd"/>
-      <w:r>
-        <w:rPr>
-          <w:rFonts w:ascii="Arial" w:hAnsi="Arial" w:cs="Arial"/>
-          <w:sz w:val="24"/>
-          <w:szCs w:val="24"/>
-        </w:rPr>
-        <w:t>_ft</w:t>
-      </w:r>
-      <w:proofErr w:type="spellEnd"/>
-      <w:r>
-        <w:rPr>
-          <w:rFonts w:ascii="Arial" w:hAnsi="Arial" w:cs="Arial"/>
-          <w:sz w:val="24"/>
-          <w:szCs w:val="24"/>
-        </w:rPr>
-        <w:t>, COUNT(</w:t>
-      </w:r>
-      <w:proofErr w:type="spellStart"/>
-      <w:proofErr w:type="gramStart"/>
-      <w:r>
-        <w:rPr>
-          <w:rFonts w:ascii="Arial" w:hAnsi="Arial" w:cs="Arial"/>
-          <w:sz w:val="24"/>
-          <w:szCs w:val="24"/>
-        </w:rPr>
-        <w:t>s.slip</w:t>
-      </w:r>
-      <w:proofErr w:type="gramEnd"/>
-      <w:r>
-        <w:rPr>
-          <w:rFonts w:ascii="Arial" w:hAnsi="Arial" w:cs="Arial"/>
-          <w:sz w:val="24"/>
-          <w:szCs w:val="24"/>
-        </w:rPr>
-        <w:t>_id</w:t>
-      </w:r>
-      <w:proofErr w:type="spellEnd"/>
-      <w:r>
-        <w:rPr>
-          <w:rFonts w:ascii="Arial" w:hAnsi="Arial" w:cs="Arial"/>
-          <w:sz w:val="24"/>
-          <w:szCs w:val="24"/>
-        </w:rPr>
-        <w:t xml:space="preserve">) AS </w:t>
-      </w:r>
-      <w:proofErr w:type="spellStart"/>
-      <w:r>
-        <w:rPr>
-          <w:rFonts w:ascii="Arial" w:hAnsi="Arial" w:cs="Arial"/>
-          <w:sz w:val="24"/>
-          <w:szCs w:val="24"/>
-        </w:rPr>
-        <w:t>available_count</w:t>
-      </w:r>
-      <w:proofErr w:type="spellEnd"/>
-    </w:p>
-    <w:p>
-      <w:pPr>
-        <w:pStyle w:val="NoSpacing"/>
-        <w:rPr>
-          <w:rFonts w:ascii="Arial" w:hAnsi="Arial" w:cs="Arial"/>
-          <w:sz w:val="24"/>
-          <w:szCs w:val="24"/>
-        </w:rPr>
-      </w:pPr>
-      <w:r>
-        <w:rPr>
-          <w:rFonts w:ascii="Arial" w:hAnsi="Arial" w:cs="Arial"/>
-          <w:sz w:val="24"/>
-          <w:szCs w:val="24"/>
-        </w:rPr>
-        <w:t xml:space="preserve">FROM </w:t>
-      </w:r>
-      <w:proofErr w:type="spellStart"/>
-      <w:r>
-        <w:rPr>
-          <w:rFonts w:ascii="Arial" w:hAnsi="Arial" w:cs="Arial"/>
-          <w:sz w:val="24"/>
-          <w:szCs w:val="24"/>
-        </w:rPr>
-        <w:t>slip_</w:t>
-      </w:r>
-      <w:proofErr w:type="gramStart"/>
-      <w:r>
-        <w:rPr>
-          <w:rFonts w:ascii="Arial" w:hAnsi="Arial" w:cs="Arial"/>
-          <w:sz w:val="24"/>
-          <w:szCs w:val="24"/>
-        </w:rPr>
-        <w:t>types</w:t>
-      </w:r>
-      <w:proofErr w:type="spellEnd"/>
-      <w:proofErr w:type="gramEnd"/>
-      <w:r>
-        <w:rPr>
-          <w:rFonts w:ascii="Arial" w:hAnsi="Arial" w:cs="Arial"/>
-          <w:sz w:val="24"/>
-          <w:szCs w:val="24"/>
-        </w:rPr>
-        <w:t xml:space="preserve"> st</w:t>
-      </w:r>
-    </w:p>
-    <w:p>
-      <w:pPr>
-        <w:pStyle w:val="NoSpacing"/>
-        <w:rPr>
-          <w:rFonts w:ascii="Arial" w:hAnsi="Arial" w:cs="Arial"/>
-          <w:sz w:val="24"/>
-          <w:szCs w:val="24"/>
-        </w:rPr>
-      </w:pPr>
-      <w:r>
-        <w:rPr>
-          <w:rFonts w:ascii="Arial" w:hAnsi="Arial" w:cs="Arial"/>
-          <w:sz w:val="24"/>
-          <w:szCs w:val="24"/>
-        </w:rPr>
-        <w:t xml:space="preserve">LEFT JOIN slips s ON </w:t>
-      </w:r>
-      <w:proofErr w:type="spellStart"/>
-      <w:proofErr w:type="gramStart"/>
-      <w:r>
-        <w:rPr>
-          <w:rFonts w:ascii="Arial" w:hAnsi="Arial" w:cs="Arial"/>
-          <w:sz w:val="24"/>
-          <w:szCs w:val="24"/>
-        </w:rPr>
-        <w:t>s.slip</w:t>
-      </w:r>
-      <w:proofErr w:type="gramEnd"/>
-      <w:r>
-        <w:rPr>
-          <w:rFonts w:ascii="Arial" w:hAnsi="Arial" w:cs="Arial"/>
-          <w:sz w:val="24"/>
-          <w:szCs w:val="24"/>
-        </w:rPr>
-        <w:t>_type_id</w:t>
-      </w:r>
-      <w:proofErr w:type="spellEnd"/>
-      <w:r>
-        <w:rPr>
-          <w:rFonts w:ascii="Arial" w:hAnsi="Arial" w:cs="Arial"/>
-          <w:sz w:val="24"/>
-          <w:szCs w:val="24"/>
-        </w:rPr>
-        <w:t xml:space="preserve"> = </w:t>
-      </w:r>
-      <w:proofErr w:type="spellStart"/>
-      <w:proofErr w:type="gramStart"/>
-      <w:r>
-        <w:rPr>
-          <w:rFonts w:ascii="Arial" w:hAnsi="Arial" w:cs="Arial"/>
-          <w:sz w:val="24"/>
-          <w:szCs w:val="24"/>
-        </w:rPr>
-        <w:t>st.slip</w:t>
-      </w:r>
-      <w:proofErr w:type="gramEnd"/>
-      <w:r>
-        <w:rPr>
-          <w:rFonts w:ascii="Arial" w:hAnsi="Arial" w:cs="Arial"/>
-          <w:sz w:val="24"/>
-          <w:szCs w:val="24"/>
-        </w:rPr>
-        <w:t>_type_id</w:t>
-      </w:r>
-      <w:proofErr w:type="spellEnd"/>
-      <w:r>
-        <w:rPr>
-          <w:rFonts w:ascii="Arial" w:hAnsi="Arial" w:cs="Arial"/>
-          <w:sz w:val="24"/>
-          <w:szCs w:val="24"/>
-        </w:rPr>
-        <w:t xml:space="preserve"> AND </w:t>
-      </w:r>
-      <w:proofErr w:type="spellStart"/>
-      <w:proofErr w:type="gramStart"/>
-      <w:r>
-        <w:rPr>
-          <w:rFonts w:ascii="Arial" w:hAnsi="Arial" w:cs="Arial"/>
-          <w:sz w:val="24"/>
-          <w:szCs w:val="24"/>
-        </w:rPr>
-        <w:t>s.status</w:t>
-      </w:r>
-      <w:proofErr w:type="spellEnd"/>
-      <w:proofErr w:type="gramEnd"/>
-      <w:r>
-        <w:rPr>
-          <w:rFonts w:ascii="Arial" w:hAnsi="Arial" w:cs="Arial"/>
-          <w:sz w:val="24"/>
-          <w:szCs w:val="24"/>
-        </w:rPr>
-        <w:t xml:space="preserve"> = 'AVAILABLE'</w:t>
-      </w:r>
-    </w:p>
-    <w:p>
-      <w:pPr>
-        <w:pStyle w:val="NoSpacing"/>
-        <w:rPr>
-          <w:rFonts w:ascii="Arial" w:hAnsi="Arial" w:cs="Arial"/>
-          <w:sz w:val="24"/>
-          <w:szCs w:val="24"/>
-        </w:rPr>
-      </w:pPr>
-      <w:r>
-        <w:rPr>
-          <w:rFonts w:ascii="Arial" w:hAnsi="Arial" w:cs="Arial"/>
-          <w:sz w:val="24"/>
-          <w:szCs w:val="24"/>
-        </w:rPr>
-        <w:t xml:space="preserve">GROUP BY </w:t>
-      </w:r>
-      <w:proofErr w:type="spellStart"/>
-      <w:proofErr w:type="gramStart"/>
-      <w:r>
-        <w:rPr>
-          <w:rFonts w:ascii="Arial" w:hAnsi="Arial" w:cs="Arial"/>
-          <w:sz w:val="24"/>
-          <w:szCs w:val="24"/>
-        </w:rPr>
-        <w:t>st.slip</w:t>
-      </w:r>
-      <w:proofErr w:type="gramEnd"/>
-      <w:r>
-        <w:rPr>
-          <w:rFonts w:ascii="Arial" w:hAnsi="Arial" w:cs="Arial"/>
-          <w:sz w:val="24"/>
-          <w:szCs w:val="24"/>
-        </w:rPr>
-        <w:t>_type_id</w:t>
-      </w:r>
-      <w:proofErr w:type="spellEnd"/>
-      <w:r>
-        <w:rPr>
-          <w:rFonts w:ascii="Arial" w:hAnsi="Arial" w:cs="Arial"/>
-          <w:sz w:val="24"/>
-          <w:szCs w:val="24"/>
-        </w:rPr>
-        <w:t xml:space="preserve">, </w:t>
-      </w:r>
-      <w:proofErr w:type="spellStart"/>
-      <w:proofErr w:type="gramStart"/>
-      <w:r>
-        <w:rPr>
-          <w:rFonts w:ascii="Arial" w:hAnsi="Arial" w:cs="Arial"/>
-          <w:sz w:val="24"/>
-          <w:szCs w:val="24"/>
-        </w:rPr>
-        <w:t>st.size</w:t>
-      </w:r>
-      <w:proofErr w:type="gramEnd"/>
-      <w:r>
-        <w:rPr>
-          <w:rFonts w:ascii="Arial" w:hAnsi="Arial" w:cs="Arial"/>
-          <w:sz w:val="24"/>
-          <w:szCs w:val="24"/>
-        </w:rPr>
-        <w:t>_ft</w:t>
-      </w:r>
-      <w:proofErr w:type="spellEnd"/>
-    </w:p>
-    <w:p>
-      <w:pPr>
-        <w:pStyle w:val="NoSpacing"/>
-        <w:rPr>
-          <w:rFonts w:ascii="Arial" w:hAnsi="Arial" w:cs="Arial"/>
-          <w:sz w:val="24"/>
-          <w:szCs w:val="24"/>
-        </w:rPr>
-      </w:pPr>
-      <w:r>
-        <w:rPr>
-          <w:rFonts w:ascii="Arial" w:hAnsi="Arial" w:cs="Arial"/>
-          <w:sz w:val="24"/>
-          <w:szCs w:val="24"/>
-        </w:rPr>
-        <w:t xml:space="preserve">ORDER BY </w:t>
-      </w:r>
-      <w:proofErr w:type="spellStart"/>
-      <w:proofErr w:type="gramStart"/>
-      <w:r>
-        <w:rPr>
-          <w:rFonts w:ascii="Arial" w:hAnsi="Arial" w:cs="Arial"/>
-          <w:sz w:val="24"/>
-          <w:szCs w:val="24"/>
-        </w:rPr>
-        <w:t>st.size</w:t>
-      </w:r>
-      <w:proofErr w:type="gramEnd"/>
-      <w:r>
-        <w:rPr>
-          <w:rFonts w:ascii="Arial" w:hAnsi="Arial" w:cs="Arial"/>
-          <w:sz w:val="24"/>
-          <w:szCs w:val="24"/>
-        </w:rPr>
-        <w:t>_ft</w:t>
-      </w:r>
-      <w:proofErr w:type="spellEnd"/>
-      <w:r>
-        <w:rPr>
-          <w:rFonts w:ascii="Arial" w:hAnsi="Arial" w:cs="Arial"/>
-          <w:sz w:val="24"/>
-          <w:szCs w:val="24"/>
-        </w:rPr>
-        <w:t>;</w:t>
-      </w:r>
-    </w:p>
-    <w:p>
-      <w:pPr>
-        <w:pStyle w:val="NoSpacing"/>
-        <w:rPr>
-          <w:rFonts w:ascii="Arial" w:hAnsi="Arial" w:cs="Arial"/>
-          <w:sz w:val="24"/>
-          <w:szCs w:val="24"/>
-        </w:rPr>
-      </w:pPr>
-    </w:p>
-    <w:p>
-      <w:pPr>
-        <w:pStyle w:val="NoSpacing"/>
-        <w:rPr>
-          <w:rFonts w:ascii="Arial" w:hAnsi="Arial" w:cs="Arial"/>
-          <w:sz w:val="24"/>
-          <w:szCs w:val="24"/>
-        </w:rPr>
-      </w:pPr>
-    </w:p>
-    <w:p>
-      <w:pPr>
-        <w:pStyle w:val="NoSpacing"/>
-        <w:rPr>
-          <w:rFonts w:ascii="Arial" w:hAnsi="Arial" w:cs="Arial"/>
-          <w:sz w:val="24"/>
-          <w:szCs w:val="24"/>
-        </w:rPr>
-      </w:pPr>
-      <w:r>
-        <w:rPr>
-          <w:rFonts w:ascii="Arial" w:hAnsi="Arial" w:cs="Arial"/>
-          <w:sz w:val="24"/>
-          <w:szCs w:val="24"/>
-        </w:rPr>
-        <w:t xml:space="preserve">SELECT </w:t>
-      </w:r>
-      <w:proofErr w:type="spellStart"/>
-      <w:proofErr w:type="gramStart"/>
-      <w:r>
-        <w:rPr>
-          <w:rFonts w:ascii="Arial" w:hAnsi="Arial" w:cs="Arial"/>
-          <w:sz w:val="24"/>
-          <w:szCs w:val="24"/>
-        </w:rPr>
-        <w:t>st.size</w:t>
-      </w:r>
-      <w:proofErr w:type="gramEnd"/>
-      <w:r>
-        <w:rPr>
-          <w:rFonts w:ascii="Arial" w:hAnsi="Arial" w:cs="Arial"/>
-          <w:sz w:val="24"/>
-          <w:szCs w:val="24"/>
-        </w:rPr>
-        <w:t>_ft</w:t>
-      </w:r>
-      <w:proofErr w:type="spellEnd"/>
-      <w:r>
-        <w:rPr>
-          <w:rFonts w:ascii="Arial" w:hAnsi="Arial" w:cs="Arial"/>
-          <w:sz w:val="24"/>
-          <w:szCs w:val="24"/>
-        </w:rPr>
-        <w:t>, COUNT(</w:t>
-      </w:r>
-      <w:proofErr w:type="spellStart"/>
-      <w:proofErr w:type="gramStart"/>
-      <w:r>
-        <w:rPr>
-          <w:rFonts w:ascii="Arial" w:hAnsi="Arial" w:cs="Arial"/>
-          <w:sz w:val="24"/>
-          <w:szCs w:val="24"/>
-        </w:rPr>
-        <w:t>w.waitlist</w:t>
-      </w:r>
-      <w:proofErr w:type="gramEnd"/>
-      <w:r>
-        <w:rPr>
-          <w:rFonts w:ascii="Arial" w:hAnsi="Arial" w:cs="Arial"/>
-          <w:sz w:val="24"/>
-          <w:szCs w:val="24"/>
-        </w:rPr>
-        <w:t>_id</w:t>
-      </w:r>
-      <w:proofErr w:type="spellEnd"/>
-      <w:r>
-        <w:rPr>
-          <w:rFonts w:ascii="Arial" w:hAnsi="Arial" w:cs="Arial"/>
-          <w:sz w:val="24"/>
-          <w:szCs w:val="24"/>
-        </w:rPr>
-        <w:t xml:space="preserve">) AS </w:t>
-      </w:r>
-      <w:proofErr w:type="spellStart"/>
-      <w:r>
-        <w:rPr>
-          <w:rFonts w:ascii="Arial" w:hAnsi="Arial" w:cs="Arial"/>
-          <w:sz w:val="24"/>
-          <w:szCs w:val="24"/>
-        </w:rPr>
-        <w:t>waiting_count</w:t>
-      </w:r>
-      <w:proofErr w:type="spellEnd"/>
-    </w:p>
-    <w:p>
-      <w:pPr>
-        <w:pStyle w:val="NoSpacing"/>
-        <w:rPr>
-          <w:rFonts w:ascii="Arial" w:hAnsi="Arial" w:cs="Arial"/>
-          <w:sz w:val="24"/>
-          <w:szCs w:val="24"/>
-        </w:rPr>
-      </w:pPr>
-      <w:r>
-        <w:rPr>
-          <w:rFonts w:ascii="Arial" w:hAnsi="Arial" w:cs="Arial"/>
-          <w:sz w:val="24"/>
-          <w:szCs w:val="24"/>
-        </w:rPr>
-        <w:t xml:space="preserve">FROM </w:t>
-      </w:r>
-      <w:proofErr w:type="spellStart"/>
-      <w:r>
-        <w:rPr>
-          <w:rFonts w:ascii="Arial" w:hAnsi="Arial" w:cs="Arial"/>
-          <w:sz w:val="24"/>
-          <w:szCs w:val="24"/>
-        </w:rPr>
-        <w:t>slip_</w:t>
-      </w:r>
-      <w:proofErr w:type="gramStart"/>
-      <w:r>
-        <w:rPr>
-          <w:rFonts w:ascii="Arial" w:hAnsi="Arial" w:cs="Arial"/>
-          <w:sz w:val="24"/>
-          <w:szCs w:val="24"/>
-        </w:rPr>
-        <w:t>types</w:t>
-      </w:r>
-      <w:proofErr w:type="spellEnd"/>
-      <w:proofErr w:type="gramEnd"/>
-      <w:r>
-        <w:rPr>
-          <w:rFonts w:ascii="Arial" w:hAnsi="Arial" w:cs="Arial"/>
-          <w:sz w:val="24"/>
-          <w:szCs w:val="24"/>
-        </w:rPr>
-        <w:t xml:space="preserve"> st</w:t>
-      </w:r>
-    </w:p>
-    <w:p>
-      <w:pPr>
-        <w:pStyle w:val="NoSpacing"/>
-        <w:rPr>
-          <w:rFonts w:ascii="Arial" w:hAnsi="Arial" w:cs="Arial"/>
-          <w:sz w:val="24"/>
-          <w:szCs w:val="24"/>
-        </w:rPr>
-      </w:pPr>
-      <w:r>
-        <w:rPr>
-          <w:rFonts w:ascii="Arial" w:hAnsi="Arial" w:cs="Arial"/>
-          <w:sz w:val="24"/>
-          <w:szCs w:val="24"/>
-        </w:rPr>
-        <w:t xml:space="preserve">LEFT JOIN </w:t>
-      </w:r>
-      <w:proofErr w:type="spellStart"/>
-      <w:r>
-        <w:rPr>
-          <w:rFonts w:ascii="Arial" w:hAnsi="Arial" w:cs="Arial"/>
-          <w:sz w:val="24"/>
-          <w:szCs w:val="24"/>
-        </w:rPr>
-        <w:t>waitlist_entries</w:t>
-      </w:r>
-      <w:proofErr w:type="spellEnd"/>
-      <w:r>
-        <w:rPr>
-          <w:rFonts w:ascii="Arial" w:hAnsi="Arial" w:cs="Arial"/>
-          <w:sz w:val="24"/>
-          <w:szCs w:val="24"/>
-        </w:rPr>
-        <w:t xml:space="preserve"> w ON </w:t>
-      </w:r>
-      <w:proofErr w:type="spellStart"/>
-      <w:proofErr w:type="gramStart"/>
-      <w:r>
-        <w:rPr>
-          <w:rFonts w:ascii="Arial" w:hAnsi="Arial" w:cs="Arial"/>
-          <w:sz w:val="24"/>
-          <w:szCs w:val="24"/>
-        </w:rPr>
-        <w:t>w.slip</w:t>
-      </w:r>
-      <w:proofErr w:type="gramEnd"/>
-      <w:r>
-        <w:rPr>
-          <w:rFonts w:ascii="Arial" w:hAnsi="Arial" w:cs="Arial"/>
-          <w:sz w:val="24"/>
-          <w:szCs w:val="24"/>
-        </w:rPr>
-        <w:t>_type_id</w:t>
-      </w:r>
-      <w:proofErr w:type="spellEnd"/>
-      <w:r>
-        <w:rPr>
-          <w:rFonts w:ascii="Arial" w:hAnsi="Arial" w:cs="Arial"/>
-          <w:sz w:val="24"/>
-          <w:szCs w:val="24"/>
-        </w:rPr>
-        <w:t xml:space="preserve"> = </w:t>
-      </w:r>
-      <w:proofErr w:type="spellStart"/>
-      <w:proofErr w:type="gramStart"/>
-      <w:r>
-        <w:rPr>
-          <w:rFonts w:ascii="Arial" w:hAnsi="Arial" w:cs="Arial"/>
-          <w:sz w:val="24"/>
-          <w:szCs w:val="24"/>
-        </w:rPr>
-        <w:t>st.slip</w:t>
-      </w:r>
-      <w:proofErr w:type="gramEnd"/>
-      <w:r>
-        <w:rPr>
-          <w:rFonts w:ascii="Arial" w:hAnsi="Arial" w:cs="Arial"/>
-          <w:sz w:val="24"/>
-          <w:szCs w:val="24"/>
-        </w:rPr>
-        <w:t>_type_id</w:t>
-      </w:r>
-      <w:proofErr w:type="spellEnd"/>
-      <w:r>
-        <w:rPr>
-          <w:rFonts w:ascii="Arial" w:hAnsi="Arial" w:cs="Arial"/>
-          <w:sz w:val="24"/>
-          <w:szCs w:val="24"/>
-        </w:rPr>
-        <w:t xml:space="preserve"> AND </w:t>
-      </w:r>
-      <w:proofErr w:type="spellStart"/>
-      <w:proofErr w:type="gramStart"/>
-      <w:r>
-        <w:rPr>
-          <w:rFonts w:ascii="Arial" w:hAnsi="Arial" w:cs="Arial"/>
-          <w:sz w:val="24"/>
-          <w:szCs w:val="24"/>
-        </w:rPr>
-        <w:t>w.status</w:t>
-      </w:r>
-      <w:proofErr w:type="spellEnd"/>
-      <w:proofErr w:type="gramEnd"/>
-      <w:r>
-        <w:rPr>
-          <w:rFonts w:ascii="Arial" w:hAnsi="Arial" w:cs="Arial"/>
-          <w:sz w:val="24"/>
-          <w:szCs w:val="24"/>
-        </w:rPr>
-        <w:t xml:space="preserve"> = 'WAITING'</w:t>
-      </w:r>
-    </w:p>
-    <w:p>
-      <w:pPr>
-        <w:pStyle w:val="NoSpacing"/>
-        <w:rPr>
-          <w:rFonts w:ascii="Arial" w:hAnsi="Arial" w:cs="Arial"/>
-          <w:sz w:val="24"/>
-          <w:szCs w:val="24"/>
-        </w:rPr>
-      </w:pPr>
-      <w:r>
-        <w:rPr>
-          <w:rFonts w:ascii="Arial" w:hAnsi="Arial" w:cs="Arial"/>
-          <w:sz w:val="24"/>
-          <w:szCs w:val="24"/>
-        </w:rPr>
-        <w:t xml:space="preserve">GROUP BY </w:t>
-      </w:r>
-      <w:proofErr w:type="spellStart"/>
-      <w:proofErr w:type="gramStart"/>
-      <w:r>
-        <w:rPr>
-          <w:rFonts w:ascii="Arial" w:hAnsi="Arial" w:cs="Arial"/>
-          <w:sz w:val="24"/>
-          <w:szCs w:val="24"/>
-        </w:rPr>
-        <w:t>st.slip</w:t>
-      </w:r>
-      <w:proofErr w:type="gramEnd"/>
-      <w:r>
-        <w:rPr>
-          <w:rFonts w:ascii="Arial" w:hAnsi="Arial" w:cs="Arial"/>
-          <w:sz w:val="24"/>
-          <w:szCs w:val="24"/>
-        </w:rPr>
-        <w:t>_type_id</w:t>
-      </w:r>
-      <w:proofErr w:type="spellEnd"/>
-      <w:r>
-        <w:rPr>
-          <w:rFonts w:ascii="Arial" w:hAnsi="Arial" w:cs="Arial"/>
-          <w:sz w:val="24"/>
-          <w:szCs w:val="24"/>
-        </w:rPr>
-        <w:t xml:space="preserve">, </w:t>
-      </w:r>
-      <w:proofErr w:type="spellStart"/>
-      <w:proofErr w:type="gramStart"/>
-      <w:r>
-        <w:rPr>
-          <w:rFonts w:ascii="Arial" w:hAnsi="Arial" w:cs="Arial"/>
-          <w:sz w:val="24"/>
-          <w:szCs w:val="24"/>
-        </w:rPr>
-        <w:t>st.size</w:t>
-      </w:r>
-      <w:proofErr w:type="gramEnd"/>
-      <w:r>
-        <w:rPr>
-          <w:rFonts w:ascii="Arial" w:hAnsi="Arial" w:cs="Arial"/>
-          <w:sz w:val="24"/>
-          <w:szCs w:val="24"/>
-        </w:rPr>
-        <w:t>_ft</w:t>
-      </w:r>
-      <w:proofErr w:type="spellEnd"/>
-    </w:p>
-    <w:p>
-      <w:pPr>
-        <w:pStyle w:val="NoSpacing"/>
-        <w:rPr>
-          <w:rFonts w:ascii="Arial" w:hAnsi="Arial" w:cs="Arial"/>
-          <w:sz w:val="24"/>
-          <w:szCs w:val="24"/>
-        </w:rPr>
-      </w:pPr>
-      <w:r>
-        <w:rPr>
-          <w:rFonts w:ascii="Arial" w:hAnsi="Arial" w:cs="Arial"/>
-          <w:sz w:val="24"/>
-          <w:szCs w:val="24"/>
-        </w:rPr>
-        <w:t xml:space="preserve">ORDER BY </w:t>
-      </w:r>
-      <w:proofErr w:type="spellStart"/>
-      <w:proofErr w:type="gramStart"/>
-      <w:r>
-        <w:rPr>
-          <w:rFonts w:ascii="Arial" w:hAnsi="Arial" w:cs="Arial"/>
-          <w:sz w:val="24"/>
-          <w:szCs w:val="24"/>
-        </w:rPr>
-        <w:t>st.size</w:t>
-      </w:r>
-      <w:proofErr w:type="gramEnd"/>
-      <w:r>
-        <w:rPr>
-          <w:rFonts w:ascii="Arial" w:hAnsi="Arial" w:cs="Arial"/>
-          <w:sz w:val="24"/>
-          <w:szCs w:val="24"/>
-        </w:rPr>
-        <w:t>_ft</w:t>
-      </w:r>
-      <w:proofErr w:type="spellEnd"/>
-      <w:r>
-        <w:rPr>
-          <w:rFonts w:ascii="Arial" w:hAnsi="Arial" w:cs="Arial"/>
-          <w:sz w:val="24"/>
-          <w:szCs w:val="24"/>
-        </w:rPr>
-        <w:t>;</w:t>
-      </w:r>
-    </w:p>
-    <w:p>
-      <w:pPr>
-        <w:pStyle w:val="NoSpacing"/>
-        <w:rPr>
-          <w:rFonts w:ascii="Arial" w:hAnsi="Arial" w:cs="Arial"/>
-          <w:sz w:val="24"/>
-          <w:szCs w:val="24"/>
-        </w:rPr>
-      </w:pPr>
-    </w:p>
-    <w:p>
-      <w:pPr>
-        <w:pStyle w:val="NoSpacing"/>
-        <w:rPr>
-          <w:rFonts w:ascii="Arial" w:hAnsi="Arial" w:cs="Arial"/>
-          <w:sz w:val="24"/>
-          <w:szCs w:val="24"/>
-        </w:rPr>
-      </w:pPr>
-    </w:p>
-    <w:p>
-      <w:pPr>
-        <w:pStyle w:val="NoSpacing"/>
-        <w:rPr>
-          <w:rFonts w:ascii="Arial" w:hAnsi="Arial" w:cs="Arial"/>
-          <w:sz w:val="24"/>
-          <w:szCs w:val="24"/>
-        </w:rPr>
-      </w:pPr>
-    </w:p>
-    <w:p>
-      <w:pPr>
-        <w:pStyle w:val="NoSpacing"/>
-        <w:rPr>
-          <w:rFonts w:ascii="Arial" w:hAnsi="Arial" w:cs="Arial"/>
-          <w:sz w:val="24"/>
-          <w:szCs w:val="24"/>
-        </w:rPr>
-      </w:pPr>
-      <w:r>
-        <w:rPr>
-          <w:rFonts w:ascii="Arial" w:hAnsi="Arial" w:cs="Arial"/>
-          <w:sz w:val="24"/>
-          <w:szCs w:val="24"/>
-        </w:rPr>
-        <w:lastRenderedPageBreak/>
-        <w:t xml:space="preserve">SELECT </w:t>
-      </w:r>
-      <w:proofErr w:type="spellStart"/>
-      <w:proofErr w:type="gramStart"/>
-      <w:r>
-        <w:rPr>
-          <w:rFonts w:ascii="Arial" w:hAnsi="Arial" w:cs="Arial"/>
-          <w:sz w:val="24"/>
-          <w:szCs w:val="24"/>
-        </w:rPr>
-        <w:t>w.waitlist</w:t>
-      </w:r>
-      <w:proofErr w:type="gramEnd"/>
-      <w:r>
-        <w:rPr>
-          <w:rFonts w:ascii="Arial" w:hAnsi="Arial" w:cs="Arial"/>
-          <w:sz w:val="24"/>
-          <w:szCs w:val="24"/>
-        </w:rPr>
-        <w:t>_id</w:t>
-      </w:r>
-      <w:proofErr w:type="spellEnd"/>
-      <w:r>
-        <w:rPr>
-          <w:rFonts w:ascii="Arial" w:hAnsi="Arial" w:cs="Arial"/>
-          <w:sz w:val="24"/>
-          <w:szCs w:val="24"/>
-        </w:rPr>
-        <w:t xml:space="preserve">, </w:t>
-      </w:r>
-      <w:proofErr w:type="spellStart"/>
-      <w:proofErr w:type="gramStart"/>
-      <w:r>
-        <w:rPr>
-          <w:rFonts w:ascii="Arial" w:hAnsi="Arial" w:cs="Arial"/>
-          <w:sz w:val="24"/>
-          <w:szCs w:val="24"/>
-        </w:rPr>
-        <w:t>b.boat</w:t>
-      </w:r>
-      <w:proofErr w:type="gramEnd"/>
-      <w:r>
-        <w:rPr>
-          <w:rFonts w:ascii="Arial" w:hAnsi="Arial" w:cs="Arial"/>
-          <w:sz w:val="24"/>
-          <w:szCs w:val="24"/>
-        </w:rPr>
-        <w:t>_name</w:t>
-      </w:r>
-      <w:proofErr w:type="spellEnd"/>
-      <w:r>
-        <w:rPr>
-          <w:rFonts w:ascii="Arial" w:hAnsi="Arial" w:cs="Arial"/>
-          <w:sz w:val="24"/>
-          <w:szCs w:val="24"/>
-        </w:rPr>
-        <w:t xml:space="preserve">, </w:t>
-      </w:r>
-      <w:proofErr w:type="spellStart"/>
-      <w:proofErr w:type="gramStart"/>
-      <w:r>
-        <w:rPr>
-          <w:rFonts w:ascii="Arial" w:hAnsi="Arial" w:cs="Arial"/>
-          <w:sz w:val="24"/>
-          <w:szCs w:val="24"/>
-        </w:rPr>
-        <w:t>st.size</w:t>
-      </w:r>
-      <w:proofErr w:type="gramEnd"/>
-      <w:r>
-        <w:rPr>
-          <w:rFonts w:ascii="Arial" w:hAnsi="Arial" w:cs="Arial"/>
-          <w:sz w:val="24"/>
-          <w:szCs w:val="24"/>
-        </w:rPr>
-        <w:t>_ft</w:t>
-      </w:r>
-      <w:proofErr w:type="spellEnd"/>
-      <w:r>
-        <w:rPr>
-          <w:rFonts w:ascii="Arial" w:hAnsi="Arial" w:cs="Arial"/>
-          <w:sz w:val="24"/>
-          <w:szCs w:val="24"/>
-        </w:rPr>
-        <w:t xml:space="preserve">, </w:t>
-      </w:r>
-      <w:proofErr w:type="spellStart"/>
-      <w:proofErr w:type="gramStart"/>
-      <w:r>
-        <w:rPr>
-          <w:rFonts w:ascii="Arial" w:hAnsi="Arial" w:cs="Arial"/>
-          <w:sz w:val="24"/>
-          <w:szCs w:val="24"/>
-        </w:rPr>
-        <w:t>w.status</w:t>
-      </w:r>
-      <w:proofErr w:type="spellEnd"/>
-      <w:proofErr w:type="gramEnd"/>
-      <w:r>
-        <w:rPr>
-          <w:rFonts w:ascii="Arial" w:hAnsi="Arial" w:cs="Arial"/>
-          <w:sz w:val="24"/>
-          <w:szCs w:val="24"/>
-        </w:rPr>
-        <w:t xml:space="preserve">, </w:t>
-      </w:r>
-      <w:proofErr w:type="spellStart"/>
-      <w:proofErr w:type="gramStart"/>
-      <w:r>
-        <w:rPr>
-          <w:rFonts w:ascii="Arial" w:hAnsi="Arial" w:cs="Arial"/>
-          <w:sz w:val="24"/>
-          <w:szCs w:val="24"/>
-        </w:rPr>
-        <w:t>w.joined</w:t>
-      </w:r>
-      <w:proofErr w:type="gramEnd"/>
-      <w:r>
-        <w:rPr>
-          <w:rFonts w:ascii="Arial" w:hAnsi="Arial" w:cs="Arial"/>
-          <w:sz w:val="24"/>
-          <w:szCs w:val="24"/>
-        </w:rPr>
-        <w:t>_at</w:t>
-      </w:r>
-      <w:proofErr w:type="spellEnd"/>
-    </w:p>
-    <w:p>
-      <w:pPr>
-        <w:pStyle w:val="NoSpacing"/>
-        <w:rPr>
-          <w:rFonts w:ascii="Arial" w:hAnsi="Arial" w:cs="Arial"/>
-          <w:sz w:val="24"/>
-          <w:szCs w:val="24"/>
-        </w:rPr>
-      </w:pPr>
-      <w:r>
-        <w:rPr>
-          <w:rFonts w:ascii="Arial" w:hAnsi="Arial" w:cs="Arial"/>
-          <w:sz w:val="24"/>
-          <w:szCs w:val="24"/>
-        </w:rPr>
-        <w:t xml:space="preserve">FROM </w:t>
-      </w:r>
-      <w:proofErr w:type="spellStart"/>
-      <w:r>
-        <w:rPr>
-          <w:rFonts w:ascii="Arial" w:hAnsi="Arial" w:cs="Arial"/>
-          <w:sz w:val="24"/>
-          <w:szCs w:val="24"/>
-        </w:rPr>
-        <w:t>waitlist_entries</w:t>
-      </w:r>
-      <w:proofErr w:type="spellEnd"/>
-      <w:r>
-        <w:rPr>
-          <w:rFonts w:ascii="Arial" w:hAnsi="Arial" w:cs="Arial"/>
-          <w:sz w:val="24"/>
-          <w:szCs w:val="24"/>
-        </w:rPr>
-        <w:t xml:space="preserve"> w</w:t>
-      </w:r>
-    </w:p>
-    <w:p>
-      <w:pPr>
-        <w:pStyle w:val="NoSpacing"/>
-        <w:rPr>
-          <w:rFonts w:ascii="Arial" w:hAnsi="Arial" w:cs="Arial"/>
-          <w:sz w:val="24"/>
-          <w:szCs w:val="24"/>
-        </w:rPr>
-      </w:pPr>
-      <w:r>
-        <w:rPr>
-          <w:rFonts w:ascii="Arial" w:hAnsi="Arial" w:cs="Arial"/>
-          <w:sz w:val="24"/>
-          <w:szCs w:val="24"/>
-        </w:rPr>
-        <w:t xml:space="preserve">JOIN customers c ON </w:t>
-      </w:r>
-      <w:proofErr w:type="spellStart"/>
-      <w:proofErr w:type="gramStart"/>
-      <w:r>
-        <w:rPr>
-          <w:rFonts w:ascii="Arial" w:hAnsi="Arial" w:cs="Arial"/>
-          <w:sz w:val="24"/>
-          <w:szCs w:val="24"/>
-        </w:rPr>
-        <w:t>c.customer</w:t>
-      </w:r>
-      <w:proofErr w:type="gramEnd"/>
-      <w:r>
-        <w:rPr>
-          <w:rFonts w:ascii="Arial" w:hAnsi="Arial" w:cs="Arial"/>
-          <w:sz w:val="24"/>
-          <w:szCs w:val="24"/>
-        </w:rPr>
-        <w:t>_id</w:t>
-      </w:r>
-      <w:proofErr w:type="spellEnd"/>
-      <w:r>
-        <w:rPr>
-          <w:rFonts w:ascii="Arial" w:hAnsi="Arial" w:cs="Arial"/>
-          <w:sz w:val="24"/>
-          <w:szCs w:val="24"/>
-        </w:rPr>
-        <w:t xml:space="preserve"> = </w:t>
-      </w:r>
-      <w:proofErr w:type="spellStart"/>
-      <w:proofErr w:type="gramStart"/>
-      <w:r>
-        <w:rPr>
-          <w:rFonts w:ascii="Arial" w:hAnsi="Arial" w:cs="Arial"/>
-          <w:sz w:val="24"/>
-          <w:szCs w:val="24"/>
-        </w:rPr>
-        <w:t>w.customer</w:t>
-      </w:r>
-      <w:proofErr w:type="gramEnd"/>
-      <w:r>
-        <w:rPr>
-          <w:rFonts w:ascii="Arial" w:hAnsi="Arial" w:cs="Arial"/>
-          <w:sz w:val="24"/>
-          <w:szCs w:val="24"/>
-        </w:rPr>
-        <w:t>_id</w:t>
-      </w:r>
-      <w:proofErr w:type="spellEnd"/>
-    </w:p>
-    <w:p>
-      <w:pPr>
-        <w:pStyle w:val="NoSpacing"/>
-        <w:rPr>
-          <w:rFonts w:ascii="Arial" w:hAnsi="Arial" w:cs="Arial"/>
-          <w:sz w:val="24"/>
-          <w:szCs w:val="24"/>
-        </w:rPr>
-      </w:pPr>
-      <w:r>
-        <w:rPr>
-          <w:rFonts w:ascii="Arial" w:hAnsi="Arial" w:cs="Arial"/>
-          <w:sz w:val="24"/>
-          <w:szCs w:val="24"/>
-        </w:rPr>
-        <w:t xml:space="preserve">JOIN boats b ON </w:t>
-      </w:r>
-      <w:proofErr w:type="spellStart"/>
-      <w:proofErr w:type="gramStart"/>
-      <w:r>
-        <w:rPr>
-          <w:rFonts w:ascii="Arial" w:hAnsi="Arial" w:cs="Arial"/>
-          <w:sz w:val="24"/>
-          <w:szCs w:val="24"/>
-        </w:rPr>
-        <w:t>b.boat</w:t>
-      </w:r>
-      <w:proofErr w:type="gramEnd"/>
-      <w:r>
-        <w:rPr>
-          <w:rFonts w:ascii="Arial" w:hAnsi="Arial" w:cs="Arial"/>
-          <w:sz w:val="24"/>
-          <w:szCs w:val="24"/>
-        </w:rPr>
-        <w:t>_id</w:t>
-      </w:r>
-      <w:proofErr w:type="spellEnd"/>
-      <w:r>
-        <w:rPr>
-          <w:rFonts w:ascii="Arial" w:hAnsi="Arial" w:cs="Arial"/>
-          <w:sz w:val="24"/>
-          <w:szCs w:val="24"/>
-        </w:rPr>
-        <w:t xml:space="preserve"> = </w:t>
-      </w:r>
-      <w:proofErr w:type="spellStart"/>
-      <w:proofErr w:type="gramStart"/>
-      <w:r>
-        <w:rPr>
-          <w:rFonts w:ascii="Arial" w:hAnsi="Arial" w:cs="Arial"/>
-          <w:sz w:val="24"/>
-          <w:szCs w:val="24"/>
-        </w:rPr>
-        <w:t>w.boat</w:t>
-      </w:r>
-      <w:proofErr w:type="gramEnd"/>
-      <w:r>
-        <w:rPr>
-          <w:rFonts w:ascii="Arial" w:hAnsi="Arial" w:cs="Arial"/>
-          <w:sz w:val="24"/>
-          <w:szCs w:val="24"/>
-        </w:rPr>
-        <w:t>_id</w:t>
-      </w:r>
-      <w:proofErr w:type="spellEnd"/>
-    </w:p>
-    <w:p>
-      <w:pPr>
-        <w:pStyle w:val="NoSpacing"/>
-        <w:rPr>
-          <w:rFonts w:ascii="Arial" w:hAnsi="Arial" w:cs="Arial"/>
-          <w:sz w:val="24"/>
-          <w:szCs w:val="24"/>
-        </w:rPr>
-      </w:pPr>
-      <w:r>
-        <w:rPr>
-          <w:rFonts w:ascii="Arial" w:hAnsi="Arial" w:cs="Arial"/>
-          <w:sz w:val="24"/>
-          <w:szCs w:val="24"/>
-        </w:rPr>
-        <w:t xml:space="preserve">JOIN </w:t>
-      </w:r>
-      <w:proofErr w:type="spellStart"/>
-      <w:r>
-        <w:rPr>
-          <w:rFonts w:ascii="Arial" w:hAnsi="Arial" w:cs="Arial"/>
-          <w:sz w:val="24"/>
-          <w:szCs w:val="24"/>
-        </w:rPr>
-        <w:t>slip_</w:t>
-      </w:r>
-      <w:proofErr w:type="gramStart"/>
-      <w:r>
-        <w:rPr>
-          <w:rFonts w:ascii="Arial" w:hAnsi="Arial" w:cs="Arial"/>
-          <w:sz w:val="24"/>
-          <w:szCs w:val="24"/>
-        </w:rPr>
-        <w:t>types</w:t>
-      </w:r>
-      <w:proofErr w:type="spellEnd"/>
-      <w:proofErr w:type="gramEnd"/>
-      <w:r>
-        <w:rPr>
-          <w:rFonts w:ascii="Arial" w:hAnsi="Arial" w:cs="Arial"/>
-          <w:sz w:val="24"/>
-          <w:szCs w:val="24"/>
-        </w:rPr>
-        <w:t xml:space="preserve"> st ON </w:t>
-      </w:r>
-      <w:proofErr w:type="spellStart"/>
-      <w:proofErr w:type="gramStart"/>
-      <w:r>
-        <w:rPr>
-          <w:rFonts w:ascii="Arial" w:hAnsi="Arial" w:cs="Arial"/>
-          <w:sz w:val="24"/>
-          <w:szCs w:val="24"/>
-        </w:rPr>
-        <w:t>st.slip</w:t>
-      </w:r>
-      <w:proofErr w:type="gramEnd"/>
-      <w:r>
-        <w:rPr>
-          <w:rFonts w:ascii="Arial" w:hAnsi="Arial" w:cs="Arial"/>
-          <w:sz w:val="24"/>
-          <w:szCs w:val="24"/>
-        </w:rPr>
-        <w:t>_type_id</w:t>
-      </w:r>
-      <w:proofErr w:type="spellEnd"/>
-      <w:r>
-        <w:rPr>
-          <w:rFonts w:ascii="Arial" w:hAnsi="Arial" w:cs="Arial"/>
-          <w:sz w:val="24"/>
-          <w:szCs w:val="24"/>
-        </w:rPr>
-        <w:t xml:space="preserve"> = </w:t>
-      </w:r>
-      <w:proofErr w:type="spellStart"/>
-      <w:proofErr w:type="gramStart"/>
-      <w:r>
-        <w:rPr>
-          <w:rFonts w:ascii="Arial" w:hAnsi="Arial" w:cs="Arial"/>
-          <w:sz w:val="24"/>
-          <w:szCs w:val="24"/>
-        </w:rPr>
-        <w:t>w.slip</w:t>
-      </w:r>
-      <w:proofErr w:type="gramEnd"/>
-      <w:r>
-        <w:rPr>
-          <w:rFonts w:ascii="Arial" w:hAnsi="Arial" w:cs="Arial"/>
-          <w:sz w:val="24"/>
-          <w:szCs w:val="24"/>
-        </w:rPr>
-        <w:t>_type_id</w:t>
-      </w:r>
-      <w:proofErr w:type="spellEnd"/>
-    </w:p>
-    <w:p>
-      <w:pPr>
-        <w:pStyle w:val="NoSpacing"/>
-        <w:rPr>
-          <w:rFonts w:ascii="Arial" w:hAnsi="Arial" w:cs="Arial"/>
-          <w:sz w:val="24"/>
-          <w:szCs w:val="24"/>
-        </w:rPr>
-      </w:pPr>
-      <w:r>
-        <w:rPr>
-          <w:rFonts w:ascii="Arial" w:hAnsi="Arial" w:cs="Arial"/>
-          <w:sz w:val="24"/>
-          <w:szCs w:val="24"/>
-        </w:rPr>
-        <w:t xml:space="preserve">WHERE </w:t>
-      </w:r>
-      <w:proofErr w:type="spellStart"/>
-      <w:proofErr w:type="gramStart"/>
-      <w:r>
-        <w:rPr>
-          <w:rFonts w:ascii="Arial" w:hAnsi="Arial" w:cs="Arial"/>
-          <w:sz w:val="24"/>
-          <w:szCs w:val="24"/>
-        </w:rPr>
-        <w:t>c.email</w:t>
-      </w:r>
-      <w:proofErr w:type="spellEnd"/>
-      <w:proofErr w:type="gramEnd"/>
-      <w:r>
-        <w:rPr>
-          <w:rFonts w:ascii="Arial" w:hAnsi="Arial" w:cs="Arial"/>
-          <w:sz w:val="24"/>
-          <w:szCs w:val="24"/>
-        </w:rPr>
-        <w:t xml:space="preserve"> = 'emily.tran@example.com';</w:t>
-      </w:r>
-    </w:p>
-    <w:p>
-      <w:pPr>
-        <w:pStyle w:val="NoSpacing"/>
-        <w:rPr>
-          <w:rFonts w:ascii="Arial" w:hAnsi="Arial" w:cs="Arial"/>
-          <w:sz w:val="24"/>
-          <w:szCs w:val="24"/>
-        </w:rPr>
-      </w:pPr>
-    </w:p>
-    <w:p>
-      <w:pPr>
-        <w:pStyle w:val="NoSpacing"/>
-        <w:rPr>
-          <w:rFonts w:ascii="Arial" w:hAnsi="Arial" w:cs="Arial"/>
-          <w:sz w:val="24"/>
-          <w:szCs w:val="24"/>
-        </w:rPr>
-      </w:pPr>
-    </w:p>
     <w:sectPr>
-      <w:headerReference w:type="default" r:id="rId17"/>
-      <w:footerReference w:type="default" r:id="rId18"/>
+      <w:headerReference w:type="default" r:id="rId27"/>
+      <w:footerReference w:type="default" r:id="rId28"/>
       <w:pgSz w:w="15840" w:h="12240" w:orient="landscape"/>
       <w:pgMar w:top="1440" w:right="1440" w:bottom="1440" w:left="1440" w:header="720" w:footer="720" w:gutter="0"/>
       <w:cols w:space="720"/>
@@ -5545,6 +4989,49 @@
 
 <file path=word/footer1.xml><?xml version="1.0" encoding="utf-8"?>
 <w:ftr xmlns:wpc="http://schemas.microsoft.com/office/word/2010/wordprocessingCanvas" xmlns:cx="http://schemas.microsoft.com/office/drawing/2014/chartex" xmlns:cx1="http://schemas.microsoft.com/office/drawing/2015/9/8/chartex" xmlns:cx2="http://schemas.microsoft.com/office/drawing/2015/10/21/chartex" xmlns:cx3="http://schemas.microsoft.com/office/drawing/2016/5/9/chartex" xmlns:cx4="http://schemas.microsoft.com/office/drawing/2016/5/10/chartex" xmlns:cx5="http://schemas.microsoft.com/office/drawing/2016/5/11/chartex" xmlns:cx6="http://schemas.microsoft.com/office/drawing/2016/5/12/chartex" xmlns:cx7="http://schemas.microsoft.com/office/drawing/2016/5/13/chartex" xmlns:cx8="http://schemas.microsoft.com/office/drawing/2016/5/14/chartex" xmlns:mc="http://schemas.openxmlformats.org/markup-compatibility/2006" xmlns:aink="http://schemas.microsoft.com/office/drawing/2016/ink" xmlns:am3d="http://schemas.microsoft.com/office/drawing/2017/model3d" xmlns:o="urn:schemas-microsoft-com:office:office" xmlns:oel="http://schemas.microsoft.com/office/2019/extlst" xmlns:r="http://schemas.openxmlformats.org/officeDocument/2006/relationships" xmlns:m="http://schemas.openxmlformats.org/officeDocument/2006/math" xmlns:v="urn:schemas-microsoft-com:vml" xmlns:wp14="http://schemas.microsoft.com/office/word/2010/wordprocessingDrawing" xmlns:wp="http://schemas.openxmlformats.org/drawingml/2006/wordprocessingDrawing" xmlns:w10="urn:schemas-microsoft-com:office:word" xmlns:w="http://schemas.openxmlformats.org/wordprocessingml/2006/main" xmlns:w14="http://schemas.microsoft.com/office/word/2010/wordml" xmlns:w15="http://schemas.microsoft.com/office/word/2012/wordml" xmlns:w16cex="http://schemas.microsoft.com/office/word/2018/wordml/cex" xmlns:w16cid="http://schemas.microsoft.com/office/word/2016/wordml/cid" xmlns:w16="http://schemas.microsoft.com/office/word/2018/wordml" xmlns:w16du="http://schemas.microsoft.com/office/word/2023/wordml/word16du" xmlns:w16sdtdh="http://schemas.microsoft.com/office/word/2020/wordml/sdtdatahash" xmlns:w16sdtfl="http://schemas.microsoft.com/office/word/2024/wordml/sdtformatlock" xmlns:w16se="http://schemas.microsoft.com/office/word/2015/wordml/symex" xmlns:wpg="http://schemas.microsoft.com/office/word/2010/wordprocessingGroup" xmlns:wpi="http://schemas.microsoft.com/office/word/2010/wordprocessingInk" xmlns:wne="http://schemas.microsoft.com/office/word/2006/wordml" xmlns:wps="http://schemas.microsoft.com/office/word/2010/wordprocessingShape" mc:Ignorable="w14 w15 w16se w16cid w16 w16cex w16sdtdh w16sdtfl w16du wp14">
+  <w:sdt>
+    <w:sdtPr>
+      <w:id w:val="24068578"/>
+      <w:docPartObj>
+        <w:docPartGallery w:val="Page Numbers (Bottom of Page)"/>
+        <w:docPartUnique/>
+      </w:docPartObj>
+    </w:sdtPr>
+    <w:sdtEndPr>
+      <w:rPr>
+        <w:noProof/>
+      </w:rPr>
+    </w:sdtEndPr>
+    <w:sdtContent>
+      <w:p>
+        <w:pPr>
+          <w:pStyle w:val="Footer"/>
+          <w:jc w:val="right"/>
+        </w:pPr>
+        <w:r>
+          <w:fldChar w:fldCharType="begin"/>
+        </w:r>
+        <w:r>
+          <w:instrText xml:space="preserve"> PAGE   \* MERGEFORMAT </w:instrText>
+        </w:r>
+        <w:r>
+          <w:fldChar w:fldCharType="separate"/>
+        </w:r>
+        <w:r>
+          <w:rPr>
+            <w:noProof/>
+          </w:rPr>
+          <w:t>2</w:t>
+        </w:r>
+        <w:r>
+          <w:rPr>
+            <w:noProof/>
+          </w:rPr>
+          <w:fldChar w:fldCharType="end"/>
+        </w:r>
+      </w:p>
+    </w:sdtContent>
+  </w:sdt>
   <w:p>
     <w:pPr>
       <w:pStyle w:val="Footer"/>
@@ -6022,7 +5509,6 @@
   <w:style w:type="character" w:default="1" w:styleId="DefaultParagraphFont">
     <w:name w:val="Default Paragraph Font"/>
     <w:uiPriority w:val="1"/>
-    <w:semiHidden/>
     <w:unhideWhenUsed/>
   </w:style>
   <w:style w:type="table" w:default="1" w:styleId="TableNormal">

</xml_diff>

<commit_message>
modified test plan Doc
</commit_message>
<xml_diff>
--- a/Module 9/GreenTeam_MoffatBay_Waitlist_TestPlan.docx
+++ b/Module 9/GreenTeam_MoffatBay_Waitlist_TestPlan.docx
@@ -305,7 +305,6 @@
                 <w:szCs w:val="20"/>
               </w:rPr>
             </w:pPr>
-            <w:proofErr w:type="spellStart"/>
             <w:r>
               <w:rPr>
                 <w:rFonts w:ascii="Arial" w:hAnsi="Arial" w:cs="Arial"/>
@@ -313,17 +312,7 @@
                 <w:sz w:val="20"/>
                 <w:szCs w:val="20"/>
               </w:rPr>
-              <w:t>Aftabur</w:t>
-            </w:r>
-            <w:proofErr w:type="spellEnd"/>
-            <w:r>
-              <w:rPr>
-                <w:rFonts w:ascii="Arial" w:hAnsi="Arial" w:cs="Arial"/>
-                <w:color w:val="EE0000"/>
-                <w:sz w:val="20"/>
-                <w:szCs w:val="20"/>
-              </w:rPr>
-              <w:t xml:space="preserve"> Rahman</w:t>
+              <w:t>Aftabur Rahman</w:t>
             </w:r>
           </w:p>
           <w:p>
@@ -1616,67 +1605,7 @@
                 <w:sz w:val="20"/>
                 <w:szCs w:val="20"/>
               </w:rPr>
-              <w:t xml:space="preserve">In phpMyAdmin or the MySQL CLI, run SELECT </w:t>
-            </w:r>
-            <w:proofErr w:type="spellStart"/>
-            <w:r>
-              <w:rPr>
-                <w:rFonts w:ascii="Arial" w:hAnsi="Arial" w:cs="Arial"/>
-                <w:color w:val="C00000"/>
-                <w:sz w:val="20"/>
-                <w:szCs w:val="20"/>
-              </w:rPr>
-              <w:t>slip_type_id</w:t>
-            </w:r>
-            <w:proofErr w:type="spellEnd"/>
-            <w:r>
-              <w:rPr>
-                <w:rFonts w:ascii="Arial" w:hAnsi="Arial" w:cs="Arial"/>
-                <w:color w:val="C00000"/>
-                <w:sz w:val="20"/>
-                <w:szCs w:val="20"/>
-              </w:rPr>
-              <w:t xml:space="preserve">, </w:t>
-            </w:r>
-            <w:proofErr w:type="gramStart"/>
-            <w:r>
-              <w:rPr>
-                <w:rFonts w:ascii="Arial" w:hAnsi="Arial" w:cs="Arial"/>
-                <w:color w:val="C00000"/>
-                <w:sz w:val="20"/>
-                <w:szCs w:val="20"/>
-              </w:rPr>
-              <w:t>COUNT(</w:t>
-            </w:r>
-            <w:proofErr w:type="gramEnd"/>
-            <w:r>
-              <w:rPr>
-                <w:rFonts w:ascii="Arial" w:hAnsi="Arial" w:cs="Arial"/>
-                <w:color w:val="C00000"/>
-                <w:sz w:val="20"/>
-                <w:szCs w:val="20"/>
-              </w:rPr>
-              <w:t xml:space="preserve">*) FROM slips WHERE status='AVAILABLE' GROUP BY </w:t>
-            </w:r>
-            <w:proofErr w:type="spellStart"/>
-            <w:r>
-              <w:rPr>
-                <w:rFonts w:ascii="Arial" w:hAnsi="Arial" w:cs="Arial"/>
-                <w:color w:val="C00000"/>
-                <w:sz w:val="20"/>
-                <w:szCs w:val="20"/>
-              </w:rPr>
-              <w:t>slip_type_id</w:t>
-            </w:r>
-            <w:proofErr w:type="spellEnd"/>
-            <w:r>
-              <w:rPr>
-                <w:rFonts w:ascii="Arial" w:hAnsi="Arial" w:cs="Arial"/>
-                <w:color w:val="C00000"/>
-                <w:sz w:val="20"/>
-                <w:szCs w:val="20"/>
-              </w:rPr>
-              <w:t>, and compare each result to the “Current Availability” value shown on the page for the matching slip size.</w:t>
+              <w:t>In phpMyAdmin or the MySQL CLI, run SELECT slip_type_id, COUNT(*) FROM slips WHERE status='AVAILABLE' GROUP BY slip_type_id, and compare each result to the “Current Availability” value shown on the page for the matching slip size.</w:t>
             </w:r>
           </w:p>
         </w:tc>
@@ -1918,107 +1847,7 @@
                 <w:sz w:val="20"/>
                 <w:szCs w:val="20"/>
               </w:rPr>
-              <w:t xml:space="preserve">Run SELECT </w:t>
-            </w:r>
-            <w:proofErr w:type="spellStart"/>
-            <w:r>
-              <w:rPr>
-                <w:rFonts w:ascii="Arial" w:hAnsi="Arial" w:cs="Arial"/>
-                <w:color w:val="C00000"/>
-                <w:sz w:val="20"/>
-                <w:szCs w:val="20"/>
-              </w:rPr>
-              <w:t>slip_type_id</w:t>
-            </w:r>
-            <w:proofErr w:type="spellEnd"/>
-            <w:r>
-              <w:rPr>
-                <w:rFonts w:ascii="Arial" w:hAnsi="Arial" w:cs="Arial"/>
-                <w:color w:val="C00000"/>
-                <w:sz w:val="20"/>
-                <w:szCs w:val="20"/>
-              </w:rPr>
-              <w:t xml:space="preserve">, </w:t>
-            </w:r>
-            <w:proofErr w:type="gramStart"/>
-            <w:r>
-              <w:rPr>
-                <w:rFonts w:ascii="Arial" w:hAnsi="Arial" w:cs="Arial"/>
-                <w:color w:val="C00000"/>
-                <w:sz w:val="20"/>
-                <w:szCs w:val="20"/>
-              </w:rPr>
-              <w:t>COUNT(</w:t>
-            </w:r>
-            <w:proofErr w:type="gramEnd"/>
-            <w:r>
-              <w:rPr>
-                <w:rFonts w:ascii="Arial" w:hAnsi="Arial" w:cs="Arial"/>
-                <w:color w:val="C00000"/>
-                <w:sz w:val="20"/>
-                <w:szCs w:val="20"/>
-              </w:rPr>
-              <w:t xml:space="preserve">*) FROM </w:t>
-            </w:r>
-            <w:proofErr w:type="spellStart"/>
-            <w:r>
-              <w:rPr>
-                <w:rFonts w:ascii="Arial" w:hAnsi="Arial" w:cs="Arial"/>
-                <w:color w:val="C00000"/>
-                <w:sz w:val="20"/>
-                <w:szCs w:val="20"/>
-              </w:rPr>
-              <w:t>waitlist_entries</w:t>
-            </w:r>
-            <w:proofErr w:type="spellEnd"/>
-            <w:r>
-              <w:rPr>
-                <w:rFonts w:ascii="Arial" w:hAnsi="Arial" w:cs="Arial"/>
-                <w:color w:val="C00000"/>
-                <w:sz w:val="20"/>
-                <w:szCs w:val="20"/>
-              </w:rPr>
-              <w:t xml:space="preserve"> WHERE status='WAITING' GROUP BY </w:t>
-            </w:r>
-            <w:proofErr w:type="spellStart"/>
-            <w:r>
-              <w:rPr>
-                <w:rFonts w:ascii="Arial" w:hAnsi="Arial" w:cs="Arial"/>
-                <w:color w:val="C00000"/>
-                <w:sz w:val="20"/>
-                <w:szCs w:val="20"/>
-              </w:rPr>
-              <w:t>slip_type_</w:t>
-            </w:r>
-            <w:proofErr w:type="gramStart"/>
-            <w:r>
-              <w:rPr>
-                <w:rFonts w:ascii="Arial" w:hAnsi="Arial" w:cs="Arial"/>
-                <w:color w:val="C00000"/>
-                <w:sz w:val="20"/>
-                <w:szCs w:val="20"/>
-              </w:rPr>
-              <w:t>id</w:t>
-            </w:r>
-            <w:proofErr w:type="spellEnd"/>
-            <w:r>
-              <w:rPr>
-                <w:rFonts w:ascii="Arial" w:hAnsi="Arial" w:cs="Arial"/>
-                <w:color w:val="C00000"/>
-                <w:sz w:val="20"/>
-                <w:szCs w:val="20"/>
-              </w:rPr>
-              <w:t>, and</w:t>
-            </w:r>
-            <w:proofErr w:type="gramEnd"/>
-            <w:r>
-              <w:rPr>
-                <w:rFonts w:ascii="Arial" w:hAnsi="Arial" w:cs="Arial"/>
-                <w:color w:val="C00000"/>
-                <w:sz w:val="20"/>
-                <w:szCs w:val="20"/>
-              </w:rPr>
-              <w:t xml:space="preserve"> compare each result to the waiting-customer count shown on the page for the matching slip size.</w:t>
+              <w:t>Run SELECT slip_type_id, COUNT(*) FROM waitlist_entries WHERE status='WAITING' GROUP BY slip_type_id, and compare each result to the waiting-customer count shown on the page for the matching slip size.</w:t>
             </w:r>
           </w:p>
         </w:tc>
@@ -2514,27 +2343,7 @@
                 <w:sz w:val="20"/>
                 <w:szCs w:val="20"/>
               </w:rPr>
-              <w:t xml:space="preserve">In </w:t>
-            </w:r>
-            <w:proofErr w:type="gramStart"/>
-            <w:r>
-              <w:rPr>
-                <w:rFonts w:ascii="Arial" w:hAnsi="Arial" w:cs="Arial"/>
-                <w:color w:val="C00000"/>
-                <w:sz w:val="20"/>
-                <w:szCs w:val="20"/>
-              </w:rPr>
-              <w:t>a second</w:t>
-            </w:r>
-            <w:proofErr w:type="gramEnd"/>
-            <w:r>
-              <w:rPr>
-                <w:rFonts w:ascii="Arial" w:hAnsi="Arial" w:cs="Arial"/>
-                <w:color w:val="C00000"/>
-                <w:sz w:val="20"/>
-                <w:szCs w:val="20"/>
-              </w:rPr>
-              <w:t xml:space="preserve"> browser tab, log in </w:t>
+              <w:t xml:space="preserve">In a second browser tab, log in </w:t>
             </w:r>
             <w:r>
               <w:rPr>
@@ -2942,7 +2751,7 @@
                 <w:sz w:val="20"/>
                 <w:szCs w:val="20"/>
               </w:rPr>
-              <w:t xml:space="preserve">Comments should be substantive; this means there should be at least 2-3 well-structured sentences with constructive feedback. </w:t>
+              <w:t>The public wait list page worked as expected and displayed the current availability and waiting counts without requiring a login. The values shown on the page matched the database queries during testing, and no customer names or identifying information were exposed. The page refreshed correctly when the underlying availability changed.</w:t>
             </w:r>
           </w:p>
         </w:tc>
@@ -4345,47 +4154,7 @@
                 <w:sz w:val="20"/>
                 <w:szCs w:val="20"/>
               </w:rPr>
-              <w:t xml:space="preserve">Query the database directly: SELECT * FROM </w:t>
-            </w:r>
-            <w:proofErr w:type="spellStart"/>
-            <w:r>
-              <w:rPr>
-                <w:rFonts w:ascii="Arial" w:hAnsi="Arial" w:cs="Arial"/>
-                <w:color w:val="C00000"/>
-                <w:sz w:val="20"/>
-                <w:szCs w:val="20"/>
-              </w:rPr>
-              <w:t>waitlist_entries</w:t>
-            </w:r>
-            <w:proofErr w:type="spellEnd"/>
-            <w:r>
-              <w:rPr>
-                <w:rFonts w:ascii="Arial" w:hAnsi="Arial" w:cs="Arial"/>
-                <w:color w:val="C00000"/>
-                <w:sz w:val="20"/>
-                <w:szCs w:val="20"/>
-              </w:rPr>
-              <w:t xml:space="preserve"> WHERE </w:t>
-            </w:r>
-            <w:proofErr w:type="spellStart"/>
-            <w:r>
-              <w:rPr>
-                <w:rFonts w:ascii="Arial" w:hAnsi="Arial" w:cs="Arial"/>
-                <w:color w:val="C00000"/>
-                <w:sz w:val="20"/>
-                <w:szCs w:val="20"/>
-              </w:rPr>
-              <w:t>customer_id</w:t>
-            </w:r>
-            <w:proofErr w:type="spellEnd"/>
-            <w:r>
-              <w:rPr>
-                <w:rFonts w:ascii="Arial" w:hAnsi="Arial" w:cs="Arial"/>
-                <w:color w:val="C00000"/>
-                <w:sz w:val="20"/>
-                <w:szCs w:val="20"/>
-              </w:rPr>
-              <w:t xml:space="preserve"> = &lt;that customer's id&gt;.</w:t>
+              <w:t>Query the database directly: SELECT * FROM waitlist_entries WHERE customer_id = &lt;that customer's id&gt;.</w:t>
             </w:r>
           </w:p>
         </w:tc>
@@ -4410,67 +4179,7 @@
                 <w:sz w:val="20"/>
                 <w:szCs w:val="20"/>
               </w:rPr>
-              <w:t xml:space="preserve">Exactly one new row exists for that customer with the correct </w:t>
-            </w:r>
-            <w:proofErr w:type="spellStart"/>
-            <w:r>
-              <w:rPr>
-                <w:rFonts w:ascii="Arial" w:hAnsi="Arial" w:cs="Arial"/>
-                <w:color w:val="C00000"/>
-                <w:sz w:val="20"/>
-                <w:szCs w:val="20"/>
-              </w:rPr>
-              <w:t>boat_id</w:t>
-            </w:r>
-            <w:proofErr w:type="spellEnd"/>
-            <w:r>
-              <w:rPr>
-                <w:rFonts w:ascii="Arial" w:hAnsi="Arial" w:cs="Arial"/>
-                <w:color w:val="C00000"/>
-                <w:sz w:val="20"/>
-                <w:szCs w:val="20"/>
-              </w:rPr>
-              <w:t xml:space="preserve">, </w:t>
-            </w:r>
-            <w:proofErr w:type="spellStart"/>
-            <w:r>
-              <w:rPr>
-                <w:rFonts w:ascii="Arial" w:hAnsi="Arial" w:cs="Arial"/>
-                <w:color w:val="C00000"/>
-                <w:sz w:val="20"/>
-                <w:szCs w:val="20"/>
-              </w:rPr>
-              <w:t>slip_type_id</w:t>
-            </w:r>
-            <w:proofErr w:type="spellEnd"/>
-            <w:r>
-              <w:rPr>
-                <w:rFonts w:ascii="Arial" w:hAnsi="Arial" w:cs="Arial"/>
-                <w:color w:val="C00000"/>
-                <w:sz w:val="20"/>
-                <w:szCs w:val="20"/>
-              </w:rPr>
-              <w:t xml:space="preserve">, status = 'WAITING', and a </w:t>
-            </w:r>
-            <w:proofErr w:type="spellStart"/>
-            <w:r>
-              <w:rPr>
-                <w:rFonts w:ascii="Arial" w:hAnsi="Arial" w:cs="Arial"/>
-                <w:color w:val="C00000"/>
-                <w:sz w:val="20"/>
-                <w:szCs w:val="20"/>
-              </w:rPr>
-              <w:t>joined_at</w:t>
-            </w:r>
-            <w:proofErr w:type="spellEnd"/>
-            <w:r>
-              <w:rPr>
-                <w:rFonts w:ascii="Arial" w:hAnsi="Arial" w:cs="Arial"/>
-                <w:color w:val="C00000"/>
-                <w:sz w:val="20"/>
-                <w:szCs w:val="20"/>
-              </w:rPr>
-              <w:t xml:space="preserve"> timestamp.</w:t>
+              <w:t>Exactly one new row exists for that customer with the correct boat_id, slip_type_id, status = 'WAITING', and a joined_at timestamp.</w:t>
             </w:r>
           </w:p>
         </w:tc>
@@ -4526,7 +4235,7 @@
                 <w:szCs w:val="20"/>
               </w:rPr>
               <w:drawing>
-                <wp:inline distT="0" distB="0" distL="0" distR="0" wp14:anchorId="2FBD51A1" wp14:editId="5714B2FD">
+                <wp:inline distT="0" distB="0" distL="0" distR="0" wp14:anchorId="2FBD51A1" wp14:editId="1AC502FB">
                   <wp:extent cx="1692266" cy="640080"/>
                   <wp:effectExtent l="0" t="0" r="3810" b="7620"/>
                   <wp:docPr id="287354403" name="Picture 9"/>
@@ -4934,7 +4643,7 @@
                 <w:sz w:val="20"/>
                 <w:szCs w:val="20"/>
               </w:rPr>
-              <w:t>Comments should be substantive; this means there should be at least 2-3 well-structured sentences with constructive feedback.</w:t>
+              <w:t>The logged-in wait list functions worked correctly during testing. Existing duplicate entries were rejected, while a new customer was successfully added to the wait list and the new database record contained the correct customer, boat, slip type, status, and timestamp. The customer’s queue position and the updated public waiting count also reflected the live database data.</w:t>
             </w:r>
           </w:p>
         </w:tc>

</xml_diff>